<commit_message>
Piece 7: 38-42 edits made
</commit_message>
<xml_diff>
--- a/Front Matter/Template/7_Front-Matter.docx
+++ b/Front Matter/Template/7_Front-Matter.docx
@@ -770,18 +770,8 @@
           <w:sz w:val="40"/>
           <w:szCs w:val="96"/>
         </w:rPr>
-        <w:t xml:space="preserve">Fung </w:t>
-      </w:r>
-      <w:proofErr w:type="spellStart"/>
-      <w:r>
-        <w:rPr>
-          <w:rFonts w:ascii="Noto Serif SC" w:eastAsia="Noto Serif SC" w:hAnsi="Noto Serif SC" w:cs="Noto Serif"/>
-          <w:sz w:val="40"/>
-          <w:szCs w:val="96"/>
-        </w:rPr>
-        <w:t>Dic-lun</w:t>
-      </w:r>
-      <w:proofErr w:type="spellEnd"/>
+        <w:t>Fung Dic-lun</w:t>
+      </w:r>
     </w:p>
     <w:p>
       <w:pPr>
@@ -1721,19 +1711,8 @@
           <w:szCs w:val="24"/>
           <w:lang w:val="en-US"/>
         </w:rPr>
-        <w:t xml:space="preserve">Ensemble </w:t>
-      </w:r>
-      <w:proofErr w:type="spellStart"/>
-      <w:r>
-        <w:rPr>
-          <w:rFonts w:ascii="Noto Serif SC" w:eastAsia="Noto Serif SC" w:hAnsi="Noto Serif SC" w:cs="Noto Serif"/>
-          <w:sz w:val="24"/>
-          <w:szCs w:val="24"/>
-          <w:lang w:val="en-US"/>
-        </w:rPr>
-        <w:t>Gending</w:t>
-      </w:r>
-      <w:proofErr w:type="spellEnd"/>
+        <w:t>Ensemble Gending</w:t>
+      </w:r>
       <w:r>
         <w:rPr>
           <w:rFonts w:ascii="Noto Serif SC" w:eastAsia="Noto Serif SC" w:hAnsi="Noto Serif SC" w:cs="Noto Serif" w:hint="eastAsia"/>
@@ -1895,47 +1874,7 @@
           <w:szCs w:val="24"/>
           <w:lang w:val="en-US"/>
         </w:rPr>
-        <w:t xml:space="preserve">Fung </w:t>
-      </w:r>
-      <w:proofErr w:type="spellStart"/>
-      <w:r>
-        <w:rPr>
-          <w:rFonts w:ascii="Noto Serif SC" w:eastAsia="Noto Serif SC" w:hAnsi="Noto Serif SC" w:cs="Noto Serif"/>
-          <w:sz w:val="24"/>
-          <w:szCs w:val="24"/>
-          <w:lang w:val="en-US"/>
-        </w:rPr>
-        <w:t>Dic</w:t>
-      </w:r>
-      <w:proofErr w:type="spellEnd"/>
-      <w:r>
-        <w:rPr>
-          <w:rFonts w:ascii="Noto Serif SC" w:eastAsia="Noto Serif SC" w:hAnsi="Noto Serif SC" w:cs="Noto Serif"/>
-          <w:sz w:val="24"/>
-          <w:szCs w:val="24"/>
-          <w:lang w:val="en-US"/>
-        </w:rPr>
-        <w:t>-Lun is a PhD student (Music Composition) under the supervision of Prof. CHAN Hing-</w:t>
-      </w:r>
-      <w:proofErr w:type="spellStart"/>
-      <w:r>
-        <w:rPr>
-          <w:rFonts w:ascii="Noto Serif SC" w:eastAsia="Noto Serif SC" w:hAnsi="Noto Serif SC" w:cs="Noto Serif"/>
-          <w:sz w:val="24"/>
-          <w:szCs w:val="24"/>
-          <w:lang w:val="en-US"/>
-        </w:rPr>
-        <w:t>yan</w:t>
-      </w:r>
-      <w:proofErr w:type="spellEnd"/>
-      <w:r>
-        <w:rPr>
-          <w:rFonts w:ascii="Noto Serif SC" w:eastAsia="Noto Serif SC" w:hAnsi="Noto Serif SC" w:cs="Noto Serif"/>
-          <w:sz w:val="24"/>
-          <w:szCs w:val="24"/>
-          <w:lang w:val="en-US"/>
-        </w:rPr>
-        <w:t xml:space="preserve"> at the University of Hong Kong, where he received his M. Phil., and B. A. degree (Music – First Class Honors).</w:t>
+        <w:t>Fung Dic-Lun is a PhD student (Music Composition) under the supervision of Prof. CHAN Hing-yan at the University of Hong Kong, where he received his M. Phil., and B. A. degree (Music – First Class Honors).</w:t>
       </w:r>
       <w:r>
         <w:rPr>
@@ -1965,27 +1904,7 @@
           <w:szCs w:val="24"/>
           <w:lang w:val="en-US"/>
         </w:rPr>
-        <w:t xml:space="preserve">Fung has exposed to Chinese music since young, and his interest further expands into ethnic music. Being well-known for composing with mixed use of ethnic and Western instruments, and unconventional instrumentations, he has achieved several international awards: 2nd prize in Sayat Nova International Composition Competition (2014), </w:t>
-      </w:r>
-      <w:proofErr w:type="spellStart"/>
-      <w:r>
-        <w:rPr>
-          <w:rFonts w:ascii="Noto Serif SC" w:eastAsia="Noto Serif SC" w:hAnsi="Noto Serif SC" w:cs="Noto Serif"/>
-          <w:sz w:val="24"/>
-          <w:szCs w:val="24"/>
-          <w:lang w:val="en-US"/>
-        </w:rPr>
-        <w:t>honourable</w:t>
-      </w:r>
-      <w:proofErr w:type="spellEnd"/>
-      <w:r>
-        <w:rPr>
-          <w:rFonts w:ascii="Noto Serif SC" w:eastAsia="Noto Serif SC" w:hAnsi="Noto Serif SC" w:cs="Noto Serif"/>
-          <w:sz w:val="24"/>
-          <w:szCs w:val="24"/>
-          <w:lang w:val="en-US"/>
-        </w:rPr>
-        <w:t xml:space="preserve"> mention in Atlas Ensemble Composition Competition (2014), 3rd runner-up in the 10th Luxembourg Sinfonietta International Composition Prize (2013), etc. His works are heard in both international and local concerts, including Croatia, Germany, the Netherlands, U. S. A., Russia, South Korea, and Indonesia; also, in renowned festivals ISCM – WMD and International Gaudeamus Music Week.</w:t>
+        <w:t>Fung has exposed to Chinese music since young, and his interest further expands into ethnic music. Being well-known for composing with mixed use of ethnic and Western instruments, and unconventional instrumentations, he has achieved several international awards: 2nd prize in Sayat Nova International Composition Competition (2014), honourable mention in Atlas Ensemble Composition Competition (2014), 3rd runner-up in the 10th Luxembourg Sinfonietta International Composition Prize (2013), etc. His works are heard in both international and local concerts, including Croatia, Germany, the Netherlands, U. S. A., Russia, South Korea, and Indonesia; also, in renowned festivals ISCM – WMD and International Gaudeamus Music Week.</w:t>
       </w:r>
       <w:r>
         <w:rPr>
@@ -2032,67 +1951,7 @@
           <w:szCs w:val="24"/>
           <w:lang w:val="en-US"/>
         </w:rPr>
-        <w:t xml:space="preserve">s works have been performed by </w:t>
-      </w:r>
-      <w:proofErr w:type="spellStart"/>
-      <w:r>
-        <w:rPr>
-          <w:rFonts w:ascii="Noto Serif SC" w:eastAsia="Noto Serif SC" w:hAnsi="Noto Serif SC" w:cs="Noto Serif"/>
-          <w:sz w:val="24"/>
-          <w:szCs w:val="24"/>
-          <w:lang w:val="en-US"/>
-        </w:rPr>
-        <w:t>guanzi</w:t>
-      </w:r>
-      <w:proofErr w:type="spellEnd"/>
-      <w:r>
-        <w:rPr>
-          <w:rFonts w:ascii="Noto Serif SC" w:eastAsia="Noto Serif SC" w:hAnsi="Noto Serif SC" w:cs="Noto Serif"/>
-          <w:sz w:val="24"/>
-          <w:szCs w:val="24"/>
-          <w:lang w:val="en-US"/>
-        </w:rPr>
-        <w:t xml:space="preserve"> virtuoso Guo Ya-</w:t>
-      </w:r>
-      <w:proofErr w:type="spellStart"/>
-      <w:r>
-        <w:rPr>
-          <w:rFonts w:ascii="Noto Serif SC" w:eastAsia="Noto Serif SC" w:hAnsi="Noto Serif SC" w:cs="Noto Serif"/>
-          <w:sz w:val="24"/>
-          <w:szCs w:val="24"/>
-          <w:lang w:val="en-US"/>
-        </w:rPr>
-        <w:t>zhi</w:t>
-      </w:r>
-      <w:proofErr w:type="spellEnd"/>
-      <w:r>
-        <w:rPr>
-          <w:rFonts w:ascii="Noto Serif SC" w:eastAsia="Noto Serif SC" w:hAnsi="Noto Serif SC" w:cs="Noto Serif"/>
-          <w:sz w:val="24"/>
-          <w:szCs w:val="24"/>
-          <w:lang w:val="en-US"/>
-        </w:rPr>
-        <w:t xml:space="preserve">, 4 Gig Heads Percussion Group, Ensemble </w:t>
-      </w:r>
-      <w:proofErr w:type="spellStart"/>
-      <w:r>
-        <w:rPr>
-          <w:rFonts w:ascii="Noto Serif SC" w:eastAsia="Noto Serif SC" w:hAnsi="Noto Serif SC" w:cs="Noto Serif"/>
-          <w:sz w:val="24"/>
-          <w:szCs w:val="24"/>
-          <w:lang w:val="en-US"/>
-        </w:rPr>
-        <w:t>Gending</w:t>
-      </w:r>
-      <w:proofErr w:type="spellEnd"/>
-      <w:r>
-        <w:rPr>
-          <w:rFonts w:ascii="Noto Serif SC" w:eastAsia="Noto Serif SC" w:hAnsi="Noto Serif SC" w:cs="Noto Serif"/>
-          <w:sz w:val="24"/>
-          <w:szCs w:val="24"/>
-          <w:lang w:val="en-US"/>
-        </w:rPr>
-        <w:t>, HRT Tamburitza Orchestra, Atlas Ensemble, International Ensemble Modern Academy, Hong Kong New Music Ensemble, Hong Kong Chinese Orchestra, Luxembourg Sinfonietta, and Ensemble Proton Bern.  As the only composer from Hong Kong, FUNG is invited to write a new work for EXPO Milano 2015</w:t>
+        <w:t>s works have been performed by guanzi virtuoso Guo Ya-zhi, 4 Gig Heads Percussion Group, Ensemble Gending, HRT Tamburitza Orchestra, Atlas Ensemble, International Ensemble Modern Academy, Hong Kong New Music Ensemble, Hong Kong Chinese Orchestra, Luxembourg Sinfonietta, and Ensemble Proton Bern.  As the only composer from Hong Kong, FUNG is invited to write a new work for EXPO Milano 2015</w:t>
       </w:r>
       <w:r>
         <w:rPr>
@@ -2428,7 +2287,6 @@
         </w:rPr>
         <w:t xml:space="preserve">The traditional Cantonese lion dance is well known for its sophisticated and technical demanding gestures. This composition draws inspiration from this gorgeous tradition, using musical materials to depict various elements in the lion dance. The melodic materials are derived from the Cantonese tune </w:t>
       </w:r>
-      <w:proofErr w:type="spellStart"/>
       <w:r>
         <w:rPr>
           <w:rFonts w:ascii="Noto Serif SC" w:eastAsia="Noto Serif SC" w:hAnsi="Noto Serif SC" w:cs="Noto Serif"/>
@@ -2440,7 +2298,6 @@
         </w:rPr>
         <w:t>Singsi</w:t>
       </w:r>
-      <w:proofErr w:type="spellEnd"/>
       <w:r>
         <w:rPr>
           <w:rFonts w:ascii="Noto Serif SC" w:eastAsia="Noto Serif SC" w:hAnsi="Noto Serif SC" w:cs="Noto Serif"/>
@@ -2522,7 +2379,6 @@
         </w:rPr>
         <w:t xml:space="preserve"> the new materials are constructed. This composition closely follows the structure of a traditional pipa piece. Apart from having </w:t>
       </w:r>
-      <w:proofErr w:type="spellStart"/>
       <w:r>
         <w:rPr>
           <w:rFonts w:ascii="Noto Serif SC" w:eastAsia="Noto Serif SC" w:hAnsi="Noto Serif SC" w:cs="Noto Serif"/>
@@ -2534,7 +2390,6 @@
         </w:rPr>
         <w:t>flavours</w:t>
       </w:r>
-      <w:proofErr w:type="spellEnd"/>
       <w:r>
         <w:rPr>
           <w:rFonts w:ascii="Noto Serif SC" w:eastAsia="Noto Serif SC" w:hAnsi="Noto Serif SC" w:cs="Noto Serif"/>
@@ -2544,7 +2399,6 @@
         </w:rPr>
         <w:t xml:space="preserve"> from both </w:t>
       </w:r>
-      <w:proofErr w:type="spellStart"/>
       <w:r>
         <w:rPr>
           <w:rFonts w:ascii="Noto Serif SC" w:eastAsia="Noto Serif SC" w:hAnsi="Noto Serif SC" w:cs="Noto Serif"/>
@@ -2556,7 +2410,6 @@
         </w:rPr>
         <w:t>wenqu</w:t>
       </w:r>
-      <w:proofErr w:type="spellEnd"/>
       <w:r>
         <w:rPr>
           <w:rFonts w:ascii="Noto Serif SC" w:eastAsia="Noto Serif SC" w:hAnsi="Noto Serif SC" w:cs="Noto Serif"/>
@@ -2566,7 +2419,6 @@
         </w:rPr>
         <w:t xml:space="preserve"> and </w:t>
       </w:r>
-      <w:proofErr w:type="spellStart"/>
       <w:r>
         <w:rPr>
           <w:rFonts w:ascii="Noto Serif SC" w:eastAsia="Noto Serif SC" w:hAnsi="Noto Serif SC" w:cs="Noto Serif"/>
@@ -2578,7 +2430,6 @@
         </w:rPr>
         <w:t>wuqu</w:t>
       </w:r>
-      <w:proofErr w:type="spellEnd"/>
       <w:r>
         <w:rPr>
           <w:rFonts w:ascii="Noto Serif SC" w:eastAsia="Noto Serif SC" w:hAnsi="Noto Serif SC" w:cs="Noto Serif"/>
@@ -2606,7 +2457,6 @@
         </w:rPr>
         <w:t xml:space="preserve">qi – </w:t>
       </w:r>
-      <w:proofErr w:type="spellStart"/>
       <w:r>
         <w:rPr>
           <w:rFonts w:ascii="Noto Serif SC" w:eastAsia="Noto Serif SC" w:hAnsi="Noto Serif SC" w:cs="Noto Serif"/>
@@ -2618,7 +2468,6 @@
         </w:rPr>
         <w:t>cheng</w:t>
       </w:r>
-      <w:proofErr w:type="spellEnd"/>
       <w:r>
         <w:rPr>
           <w:rFonts w:ascii="Noto Serif SC" w:eastAsia="Noto Serif SC" w:hAnsi="Noto Serif SC" w:cs="Noto Serif"/>
@@ -2628,7 +2477,6 @@
         </w:rPr>
         <w:t xml:space="preserve">- </w:t>
       </w:r>
-      <w:proofErr w:type="spellStart"/>
       <w:r>
         <w:rPr>
           <w:rFonts w:ascii="Noto Serif SC" w:eastAsia="Noto Serif SC" w:hAnsi="Noto Serif SC" w:cs="Noto Serif"/>
@@ -2640,7 +2488,6 @@
         </w:rPr>
         <w:t>zhuan</w:t>
       </w:r>
-      <w:proofErr w:type="spellEnd"/>
       <w:r>
         <w:rPr>
           <w:rFonts w:ascii="Noto Serif SC" w:eastAsia="Noto Serif SC" w:hAnsi="Noto Serif SC" w:cs="Noto Serif"/>
@@ -2761,7 +2608,6 @@
         </w:rPr>
         <w:t xml:space="preserve">2 </w:t>
       </w:r>
-      <w:proofErr w:type="spellStart"/>
       <w:r>
         <w:rPr>
           <w:rFonts w:ascii="Noto Serif SC" w:eastAsia="Noto Serif SC" w:hAnsi="Noto Serif SC" w:cs="Noto Serif"/>
@@ -2771,7 +2617,6 @@
         </w:rPr>
         <w:t>Bangdi</w:t>
       </w:r>
-      <w:proofErr w:type="spellEnd"/>
       <w:r>
         <w:rPr>
           <w:rFonts w:ascii="Noto Serif SC" w:eastAsia="Noto Serif SC" w:hAnsi="Noto Serif SC" w:cs="Noto Serif"/>
@@ -2852,39 +2697,900 @@
           <w:szCs w:val="20"/>
           <w:lang w:val="en-GB"/>
         </w:rPr>
-        <w:t xml:space="preserve">I </w:t>
-      </w:r>
-      <w:proofErr w:type="spellStart"/>
-      <w:r>
-        <w:rPr>
-          <w:rFonts w:ascii="Noto Serif SC" w:eastAsia="Noto Serif SC" w:hAnsi="Noto Serif SC" w:cs="Noto Serif"/>
-          <w:sz w:val="20"/>
-          <w:szCs w:val="20"/>
+        <w:t>I doub. Xiaodi</w:t>
+      </w:r>
+    </w:p>
+    <w:p>
+      <w:pPr>
+        <w:rPr>
+          <w:rFonts w:ascii="Noto Serif SC" w:eastAsia="Noto Serif SC" w:hAnsi="Noto Serif SC" w:cs="Noto Serif"/>
+          <w:sz w:val="24"/>
+          <w:szCs w:val="24"/>
+          <w:lang w:val="en-US"/>
+        </w:rPr>
+      </w:pPr>
+      <w:r>
+        <w:rPr>
+          <w:rFonts w:ascii="Noto Serif SC" w:eastAsia="Noto Serif SC" w:hAnsi="Noto Serif SC" w:cs="Noto Serif"/>
+          <w:sz w:val="24"/>
+          <w:szCs w:val="24"/>
+          <w:lang w:val="en-US"/>
+        </w:rPr>
+        <w:t xml:space="preserve">1 </w:t>
+      </w:r>
+      <w:r>
+        <w:rPr>
+          <w:rFonts w:ascii="Noto Serif SC" w:eastAsia="Noto Serif SC" w:hAnsi="Noto Serif SC" w:cs="Noto Serif" w:hint="eastAsia"/>
+          <w:sz w:val="24"/>
+          <w:szCs w:val="24"/>
+          <w:lang w:val="en-US"/>
+        </w:rPr>
+        <w:t>曲笛</w:t>
+      </w:r>
+      <w:r>
+        <w:rPr>
+          <w:rFonts w:ascii="Noto Serif SC" w:eastAsia="Noto Serif SC" w:hAnsi="Noto Serif SC" w:cs="Noto Serif"/>
+          <w:sz w:val="24"/>
+          <w:szCs w:val="24"/>
+          <w:lang w:val="en-US"/>
+        </w:rPr>
+        <w:t xml:space="preserve"> </w:t>
+      </w:r>
+      <w:r>
+        <w:rPr>
+          <w:rFonts w:ascii="Noto Serif SC" w:eastAsia="Noto Serif SC" w:hAnsi="Noto Serif SC" w:cs="Noto Serif"/>
+          <w:sz w:val="24"/>
+          <w:szCs w:val="24"/>
+          <w:lang w:val="en-US"/>
+        </w:rPr>
+        <w:t xml:space="preserve">1 </w:t>
+      </w:r>
+      <w:r>
+        <w:rPr>
+          <w:rFonts w:ascii="Noto Serif SC" w:eastAsia="Noto Serif SC" w:hAnsi="Noto Serif SC" w:cs="Noto Serif"/>
+          <w:sz w:val="24"/>
+          <w:szCs w:val="24"/>
+          <w:lang w:val="en-US"/>
+        </w:rPr>
+        <w:t>Qudi</w:t>
+      </w:r>
+    </w:p>
+    <w:p>
+      <w:pPr>
+        <w:spacing w:after="120"/>
+        <w:rPr>
+          <w:rFonts w:ascii="Noto Serif SC" w:eastAsia="Noto Serif SC" w:hAnsi="Noto Serif SC" w:cs="Noto Serif"/>
+          <w:sz w:val="24"/>
+          <w:szCs w:val="24"/>
+          <w:lang w:val="en-US"/>
+        </w:rPr>
+      </w:pPr>
+      <w:r>
+        <w:rPr>
+          <w:rFonts w:ascii="Noto Serif SC" w:eastAsia="Noto Serif SC" w:hAnsi="Noto Serif SC" w:cs="Noto Serif"/>
+          <w:sz w:val="24"/>
+          <w:szCs w:val="24"/>
+          <w:lang w:val="en-US"/>
+        </w:rPr>
+        <w:t xml:space="preserve">2 </w:t>
+      </w:r>
+      <w:r>
+        <w:rPr>
+          <w:rFonts w:ascii="Noto Serif SC" w:eastAsia="Noto Serif SC" w:hAnsi="Noto Serif SC" w:cs="Noto Serif" w:hint="eastAsia"/>
+          <w:sz w:val="24"/>
+          <w:szCs w:val="24"/>
+          <w:lang w:val="en-US"/>
+        </w:rPr>
+        <w:t>新笛</w:t>
+      </w:r>
+      <w:r>
+        <w:rPr>
+          <w:rFonts w:ascii="Noto Serif SC" w:eastAsia="Noto Serif SC" w:hAnsi="Noto Serif SC" w:cs="Noto Serif"/>
+          <w:sz w:val="24"/>
+          <w:szCs w:val="24"/>
+          <w:lang w:val="en-US"/>
+        </w:rPr>
+        <w:t xml:space="preserve"> </w:t>
+      </w:r>
+      <w:r>
+        <w:rPr>
+          <w:rFonts w:ascii="Noto Serif SC" w:eastAsia="Noto Serif SC" w:hAnsi="Noto Serif SC" w:cs="Noto Serif"/>
+          <w:sz w:val="24"/>
+          <w:szCs w:val="24"/>
+          <w:lang w:val="en-US"/>
+        </w:rPr>
+        <w:t xml:space="preserve">2 </w:t>
+      </w:r>
+      <w:r>
+        <w:rPr>
+          <w:rFonts w:ascii="Noto Serif SC" w:eastAsia="Noto Serif SC" w:hAnsi="Noto Serif SC" w:cs="Noto Serif"/>
+          <w:sz w:val="24"/>
+          <w:szCs w:val="24"/>
+          <w:lang w:val="en-US"/>
+        </w:rPr>
+        <w:t>Xindi</w:t>
+      </w:r>
+    </w:p>
+    <w:p>
+      <w:pPr>
+        <w:rPr>
+          <w:rFonts w:ascii="Noto Serif SC" w:eastAsia="Noto Serif SC" w:hAnsi="Noto Serif SC" w:cs="Noto Serif"/>
+          <w:sz w:val="24"/>
+          <w:szCs w:val="24"/>
+          <w:lang w:val="en-US"/>
+        </w:rPr>
+      </w:pPr>
+      <w:r>
+        <w:rPr>
+          <w:rFonts w:ascii="Noto Serif SC" w:eastAsia="Noto Serif SC" w:hAnsi="Noto Serif SC" w:cs="Noto Serif"/>
+          <w:sz w:val="24"/>
+          <w:szCs w:val="24"/>
+          <w:lang w:val="en-US"/>
+        </w:rPr>
+        <w:t xml:space="preserve">2 </w:t>
+      </w:r>
+      <w:r>
+        <w:rPr>
+          <w:rFonts w:ascii="Noto Serif SC" w:eastAsia="Noto Serif SC" w:hAnsi="Noto Serif SC" w:cs="Noto Serif" w:hint="eastAsia"/>
+          <w:sz w:val="24"/>
+          <w:szCs w:val="24"/>
+          <w:lang w:val="en-US"/>
+        </w:rPr>
+        <w:t>高音笙</w:t>
+      </w:r>
+      <w:r>
+        <w:rPr>
+          <w:rFonts w:ascii="Noto Serif SC" w:eastAsia="Noto Serif SC" w:hAnsi="Noto Serif SC" w:cs="Noto Serif"/>
+          <w:sz w:val="24"/>
+          <w:szCs w:val="24"/>
+          <w:lang w:val="en-US"/>
+        </w:rPr>
+        <w:t xml:space="preserve"> </w:t>
+      </w:r>
+      <w:r>
+        <w:rPr>
+          <w:rFonts w:ascii="Noto Serif SC" w:eastAsia="Noto Serif SC" w:hAnsi="Noto Serif SC" w:cs="Noto Serif"/>
+          <w:sz w:val="24"/>
+          <w:szCs w:val="24"/>
+          <w:lang w:val="en-US"/>
+        </w:rPr>
+        <w:t xml:space="preserve">2 </w:t>
+      </w:r>
+      <w:r>
+        <w:rPr>
+          <w:rFonts w:ascii="Noto Serif SC" w:eastAsia="Noto Serif SC" w:hAnsi="Noto Serif SC" w:cs="Noto Serif"/>
+          <w:sz w:val="24"/>
+          <w:szCs w:val="24"/>
+          <w:lang w:val="en-US"/>
+        </w:rPr>
+        <w:t>Gaoyin Sheng</w:t>
+      </w:r>
+    </w:p>
+    <w:p>
+      <w:pPr>
+        <w:rPr>
+          <w:rFonts w:ascii="Noto Serif SC" w:eastAsia="Noto Serif SC" w:hAnsi="Noto Serif SC" w:cs="Noto Serif"/>
+          <w:sz w:val="24"/>
+          <w:szCs w:val="24"/>
+          <w:lang w:val="en-US"/>
+        </w:rPr>
+      </w:pPr>
+      <w:r>
+        <w:rPr>
+          <w:rFonts w:ascii="Noto Serif SC" w:eastAsia="Noto Serif SC" w:hAnsi="Noto Serif SC" w:cs="Noto Serif"/>
+          <w:sz w:val="24"/>
+          <w:szCs w:val="24"/>
+          <w:lang w:val="en-US"/>
+        </w:rPr>
+        <w:t xml:space="preserve">2 </w:t>
+      </w:r>
+      <w:r>
+        <w:rPr>
+          <w:rFonts w:ascii="Noto Serif SC" w:eastAsia="Noto Serif SC" w:hAnsi="Noto Serif SC" w:cs="Noto Serif" w:hint="eastAsia"/>
+          <w:sz w:val="24"/>
+          <w:szCs w:val="24"/>
+          <w:lang w:val="en-US"/>
+        </w:rPr>
+        <w:t>中音笙</w:t>
+      </w:r>
+      <w:r>
+        <w:rPr>
+          <w:rFonts w:ascii="Noto Serif SC" w:eastAsia="Noto Serif SC" w:hAnsi="Noto Serif SC" w:cs="Noto Serif"/>
+          <w:sz w:val="24"/>
+          <w:szCs w:val="24"/>
+          <w:lang w:val="en-US"/>
+        </w:rPr>
+        <w:t xml:space="preserve"> </w:t>
+      </w:r>
+      <w:r>
+        <w:rPr>
+          <w:rFonts w:ascii="Noto Serif SC" w:eastAsia="Noto Serif SC" w:hAnsi="Noto Serif SC" w:cs="Noto Serif"/>
+          <w:sz w:val="24"/>
+          <w:szCs w:val="24"/>
+          <w:lang w:val="en-US"/>
+        </w:rPr>
+        <w:t xml:space="preserve">2 </w:t>
+      </w:r>
+      <w:r>
+        <w:rPr>
+          <w:rFonts w:ascii="Noto Serif SC" w:eastAsia="Noto Serif SC" w:hAnsi="Noto Serif SC" w:cs="Noto Serif"/>
+          <w:sz w:val="24"/>
+          <w:szCs w:val="24"/>
+          <w:lang w:val="en-US"/>
+        </w:rPr>
+        <w:t>Zhongyin Sheng</w:t>
+      </w:r>
+    </w:p>
+    <w:p>
+      <w:pPr>
+        <w:spacing w:after="120"/>
+        <w:rPr>
+          <w:rFonts w:ascii="Noto Serif SC" w:eastAsia="Noto Serif SC" w:hAnsi="Noto Serif SC" w:cs="Noto Serif"/>
+          <w:sz w:val="24"/>
+          <w:szCs w:val="24"/>
+          <w:lang w:val="en-US"/>
+        </w:rPr>
+      </w:pPr>
+      <w:r>
+        <w:rPr>
+          <w:rFonts w:ascii="Noto Serif SC" w:eastAsia="Noto Serif SC" w:hAnsi="Noto Serif SC" w:cs="Noto Serif"/>
+          <w:sz w:val="24"/>
+          <w:szCs w:val="24"/>
+          <w:lang w:val="en-US"/>
+        </w:rPr>
+        <w:t xml:space="preserve">1 </w:t>
+      </w:r>
+      <w:r>
+        <w:rPr>
+          <w:rFonts w:ascii="Noto Serif SC" w:eastAsia="Noto Serif SC" w:hAnsi="Noto Serif SC" w:cs="Noto Serif" w:hint="eastAsia"/>
+          <w:sz w:val="24"/>
+          <w:szCs w:val="24"/>
+          <w:lang w:val="en-US"/>
+        </w:rPr>
+        <w:t>低音笙</w:t>
+      </w:r>
+      <w:r>
+        <w:rPr>
+          <w:rFonts w:ascii="Noto Serif SC" w:eastAsia="Noto Serif SC" w:hAnsi="Noto Serif SC" w:cs="Noto Serif"/>
+          <w:sz w:val="24"/>
+          <w:szCs w:val="24"/>
+          <w:lang w:val="en-US"/>
+        </w:rPr>
+        <w:t xml:space="preserve"> 1 Diyin Sheng</w:t>
+      </w:r>
+    </w:p>
+    <w:p>
+      <w:pPr>
+        <w:rPr>
+          <w:rFonts w:ascii="Noto Serif SC" w:eastAsia="Noto Serif SC" w:hAnsi="Noto Serif SC" w:cs="Noto Serif"/>
+          <w:sz w:val="24"/>
+          <w:szCs w:val="24"/>
+          <w:lang w:val="en-US"/>
+        </w:rPr>
+      </w:pPr>
+      <w:r>
+        <w:rPr>
+          <w:rFonts w:ascii="Noto Serif SC" w:eastAsia="Noto Serif SC" w:hAnsi="Noto Serif SC" w:cs="Noto Serif"/>
+          <w:sz w:val="24"/>
+          <w:szCs w:val="24"/>
+          <w:lang w:val="en-US"/>
+        </w:rPr>
+        <w:t xml:space="preserve">2 </w:t>
+      </w:r>
+      <w:r>
+        <w:rPr>
+          <w:rFonts w:ascii="Noto Serif SC" w:eastAsia="Noto Serif SC" w:hAnsi="Noto Serif SC" w:cs="Noto Serif" w:hint="eastAsia"/>
+          <w:sz w:val="24"/>
+          <w:szCs w:val="24"/>
+          <w:lang w:val="en-US"/>
+        </w:rPr>
+        <w:t>高音加键唢吶</w:t>
+      </w:r>
+      <w:r>
+        <w:rPr>
+          <w:rFonts w:ascii="Noto Serif SC" w:eastAsia="Noto Serif SC" w:hAnsi="Noto Serif SC" w:cs="Noto Serif"/>
+          <w:sz w:val="24"/>
+          <w:szCs w:val="24"/>
+          <w:lang w:val="en-US"/>
+        </w:rPr>
+        <w:t xml:space="preserve"> </w:t>
+      </w:r>
+      <w:r>
+        <w:rPr>
+          <w:rFonts w:ascii="Noto Serif SC" w:eastAsia="Noto Serif SC" w:hAnsi="Noto Serif SC" w:cs="Noto Serif"/>
+          <w:sz w:val="24"/>
+          <w:szCs w:val="24"/>
+          <w:lang w:val="en-US"/>
+        </w:rPr>
+        <w:t xml:space="preserve">2 </w:t>
+      </w:r>
+      <w:r>
+        <w:rPr>
+          <w:rFonts w:ascii="Noto Serif SC" w:eastAsia="Noto Serif SC" w:hAnsi="Noto Serif SC" w:cs="Noto Serif"/>
+          <w:sz w:val="24"/>
+          <w:szCs w:val="24"/>
+          <w:lang w:val="en-US"/>
+        </w:rPr>
+        <w:t>Gaoyin Suona</w:t>
+      </w:r>
+    </w:p>
+    <w:p>
+      <w:pPr>
+        <w:rPr>
+          <w:rFonts w:ascii="Noto Serif SC" w:eastAsia="Noto Serif SC" w:hAnsi="Noto Serif SC" w:cs="Noto Serif"/>
+          <w:sz w:val="24"/>
+          <w:szCs w:val="24"/>
+          <w:lang w:val="en-US"/>
+        </w:rPr>
+      </w:pPr>
+      <w:r>
+        <w:rPr>
+          <w:rFonts w:ascii="Noto Serif SC" w:eastAsia="Noto Serif SC" w:hAnsi="Noto Serif SC" w:cs="Noto Serif"/>
+          <w:sz w:val="24"/>
+          <w:szCs w:val="24"/>
+          <w:lang w:val="en-US"/>
+        </w:rPr>
+        <w:t>1</w:t>
+      </w:r>
+      <w:r>
+        <w:rPr>
+          <w:rFonts w:ascii="Noto Serif SC" w:eastAsia="Noto Serif SC" w:hAnsi="Noto Serif SC" w:cs="Noto Serif" w:hint="eastAsia"/>
+          <w:sz w:val="24"/>
+          <w:szCs w:val="24"/>
+          <w:lang w:val="en-US"/>
+        </w:rPr>
+        <w:t>中音加键唢吶</w:t>
+      </w:r>
+      <w:r>
+        <w:rPr>
+          <w:rFonts w:ascii="Noto Serif SC" w:eastAsia="Noto Serif SC" w:hAnsi="Noto Serif SC" w:cs="Noto Serif"/>
+          <w:sz w:val="24"/>
+          <w:szCs w:val="24"/>
+          <w:lang w:val="en-US"/>
+        </w:rPr>
+        <w:t xml:space="preserve"> </w:t>
+      </w:r>
+      <w:r>
+        <w:rPr>
+          <w:rFonts w:ascii="Noto Serif SC" w:eastAsia="Noto Serif SC" w:hAnsi="Noto Serif SC" w:cs="Noto Serif"/>
+          <w:sz w:val="24"/>
+          <w:szCs w:val="24"/>
+          <w:lang w:val="en-US"/>
+        </w:rPr>
+        <w:t xml:space="preserve">1 </w:t>
+      </w:r>
+      <w:r>
+        <w:rPr>
+          <w:rFonts w:ascii="Noto Serif SC" w:eastAsia="Noto Serif SC" w:hAnsi="Noto Serif SC" w:cs="Noto Serif"/>
+          <w:sz w:val="24"/>
+          <w:szCs w:val="24"/>
+          <w:lang w:val="en-US"/>
+        </w:rPr>
+        <w:t>Zhongyin Suona</w:t>
+      </w:r>
+    </w:p>
+    <w:p>
+      <w:pPr>
+        <w:rPr>
+          <w:rFonts w:ascii="Noto Serif SC" w:eastAsia="Noto Serif SC" w:hAnsi="Noto Serif SC" w:cs="Noto Serif"/>
+          <w:sz w:val="24"/>
+          <w:szCs w:val="24"/>
+          <w:lang w:val="en-US"/>
+        </w:rPr>
+      </w:pPr>
+      <w:r>
+        <w:rPr>
+          <w:rFonts w:ascii="Noto Serif SC" w:eastAsia="Noto Serif SC" w:hAnsi="Noto Serif SC" w:cs="Noto Serif"/>
+          <w:sz w:val="24"/>
+          <w:szCs w:val="24"/>
+          <w:lang w:val="en-US"/>
+        </w:rPr>
+        <w:t>1</w:t>
+      </w:r>
+      <w:r>
+        <w:rPr>
+          <w:rFonts w:ascii="Noto Serif SC" w:eastAsia="Noto Serif SC" w:hAnsi="Noto Serif SC" w:cs="Noto Serif" w:hint="eastAsia"/>
+          <w:sz w:val="24"/>
+          <w:szCs w:val="24"/>
+          <w:lang w:val="en-US"/>
+        </w:rPr>
+        <w:t>低音加键唢吶</w:t>
+      </w:r>
+      <w:r>
+        <w:rPr>
+          <w:rFonts w:ascii="Noto Serif SC" w:eastAsia="Noto Serif SC" w:hAnsi="Noto Serif SC" w:cs="Noto Serif"/>
+          <w:sz w:val="24"/>
+          <w:szCs w:val="24"/>
+          <w:lang w:val="en-US"/>
+        </w:rPr>
+        <w:t xml:space="preserve"> </w:t>
+      </w:r>
+      <w:r>
+        <w:rPr>
+          <w:rFonts w:ascii="Noto Serif SC" w:eastAsia="Noto Serif SC" w:hAnsi="Noto Serif SC" w:cs="Noto Serif"/>
+          <w:sz w:val="24"/>
+          <w:szCs w:val="24"/>
+          <w:lang w:val="en-US"/>
+        </w:rPr>
+        <w:t xml:space="preserve">1 </w:t>
+      </w:r>
+      <w:r>
+        <w:rPr>
+          <w:rFonts w:ascii="Noto Serif SC" w:eastAsia="Noto Serif SC" w:hAnsi="Noto Serif SC" w:cs="Noto Serif"/>
+          <w:sz w:val="24"/>
+          <w:szCs w:val="24"/>
+          <w:lang w:val="en-US"/>
+        </w:rPr>
+        <w:t>Diyin Suona</w:t>
+      </w:r>
+    </w:p>
+    <w:p>
+      <w:pPr>
+        <w:rPr>
+          <w:rFonts w:ascii="Noto Serif SC" w:eastAsia="Noto Serif SC" w:hAnsi="Noto Serif SC" w:cs="Noto Serif"/>
+          <w:sz w:val="24"/>
+          <w:szCs w:val="24"/>
           <w:lang w:val="en-GB"/>
         </w:rPr>
-        <w:t>doub</w:t>
-      </w:r>
-      <w:proofErr w:type="spellEnd"/>
-      <w:r>
-        <w:rPr>
-          <w:rFonts w:ascii="Noto Serif SC" w:eastAsia="Noto Serif SC" w:hAnsi="Noto Serif SC" w:cs="Noto Serif"/>
-          <w:sz w:val="20"/>
-          <w:szCs w:val="20"/>
+      </w:pPr>
+      <w:r>
+        <w:rPr>
+          <w:rFonts w:ascii="Noto Serif SC" w:eastAsia="Noto Serif SC" w:hAnsi="Noto Serif SC" w:cs="Noto Serif"/>
+          <w:sz w:val="24"/>
+          <w:szCs w:val="24"/>
           <w:lang w:val="en-GB"/>
         </w:rPr>
-        <w:t xml:space="preserve">. </w:t>
-      </w:r>
-      <w:proofErr w:type="spellStart"/>
-      <w:r>
-        <w:rPr>
-          <w:rFonts w:ascii="Noto Serif SC" w:eastAsia="Noto Serif SC" w:hAnsi="Noto Serif SC" w:cs="Noto Serif"/>
-          <w:sz w:val="20"/>
-          <w:szCs w:val="20"/>
+        <w:t>1</w:t>
+      </w:r>
+      <w:r>
+        <w:rPr>
+          <w:rFonts w:ascii="Noto Serif SC" w:eastAsia="Noto Serif SC" w:hAnsi="Noto Serif SC" w:cs="Noto Serif" w:hint="eastAsia"/>
+          <w:sz w:val="24"/>
+          <w:szCs w:val="24"/>
           <w:lang w:val="en-GB"/>
         </w:rPr>
-        <w:t>Xiaodi</w:t>
-      </w:r>
-      <w:proofErr w:type="spellEnd"/>
+        <w:t>中音加键管</w:t>
+      </w:r>
+      <w:r>
+        <w:rPr>
+          <w:rFonts w:ascii="Noto Serif SC" w:eastAsia="Noto Serif SC" w:hAnsi="Noto Serif SC" w:cs="Noto Serif"/>
+          <w:sz w:val="24"/>
+          <w:szCs w:val="24"/>
+          <w:lang w:val="en-GB"/>
+        </w:rPr>
+        <w:t xml:space="preserve"> </w:t>
+      </w:r>
+      <w:r>
+        <w:rPr>
+          <w:rFonts w:ascii="Noto Serif SC" w:eastAsia="Noto Serif SC" w:hAnsi="Noto Serif SC" w:cs="Noto Serif"/>
+          <w:sz w:val="24"/>
+          <w:szCs w:val="24"/>
+          <w:lang w:val="en-GB"/>
+        </w:rPr>
+        <w:t xml:space="preserve">1 Keyed </w:t>
+      </w:r>
+      <w:r>
+        <w:rPr>
+          <w:rFonts w:ascii="Noto Serif SC" w:eastAsia="Noto Serif SC" w:hAnsi="Noto Serif SC" w:cs="Noto Serif"/>
+          <w:sz w:val="24"/>
+          <w:szCs w:val="24"/>
+          <w:lang w:val="en-GB"/>
+        </w:rPr>
+        <w:t>Zhongyin Guan</w:t>
+      </w:r>
+    </w:p>
+    <w:p>
+      <w:pPr>
+        <w:rPr>
+          <w:rFonts w:ascii="Noto Serif SC" w:eastAsia="Noto Serif SC" w:hAnsi="Noto Serif SC" w:cs="Noto Serif"/>
+          <w:sz w:val="24"/>
+          <w:szCs w:val="24"/>
+          <w:lang w:val="en-GB"/>
+        </w:rPr>
+      </w:pPr>
+      <w:r>
+        <w:rPr>
+          <w:rFonts w:ascii="Noto Serif SC" w:eastAsia="Noto Serif SC" w:hAnsi="Noto Serif SC" w:cs="Noto Serif"/>
+          <w:sz w:val="24"/>
+          <w:szCs w:val="24"/>
+          <w:lang w:val="en-GB"/>
+        </w:rPr>
+        <w:t>1</w:t>
+      </w:r>
+      <w:r>
+        <w:rPr>
+          <w:rFonts w:ascii="Noto Serif SC" w:eastAsia="Noto Serif SC" w:hAnsi="Noto Serif SC" w:cs="Noto Serif" w:hint="eastAsia"/>
+          <w:sz w:val="24"/>
+          <w:szCs w:val="24"/>
+          <w:lang w:val="en-GB"/>
+        </w:rPr>
+        <w:t>低音加键管</w:t>
+      </w:r>
+      <w:r>
+        <w:rPr>
+          <w:rFonts w:ascii="Noto Serif SC" w:eastAsia="Noto Serif SC" w:hAnsi="Noto Serif SC" w:cs="Noto Serif"/>
+          <w:sz w:val="24"/>
+          <w:szCs w:val="24"/>
+          <w:lang w:val="en-GB"/>
+        </w:rPr>
+        <w:t xml:space="preserve"> </w:t>
+      </w:r>
+      <w:r>
+        <w:rPr>
+          <w:rFonts w:ascii="Noto Serif SC" w:eastAsia="Noto Serif SC" w:hAnsi="Noto Serif SC" w:cs="Noto Serif"/>
+          <w:sz w:val="24"/>
+          <w:szCs w:val="24"/>
+          <w:lang w:val="en-GB"/>
+        </w:rPr>
+        <w:t xml:space="preserve">1 Keyed </w:t>
+      </w:r>
+      <w:r>
+        <w:rPr>
+          <w:rFonts w:ascii="Noto Serif SC" w:eastAsia="Noto Serif SC" w:hAnsi="Noto Serif SC" w:cs="Noto Serif"/>
+          <w:sz w:val="24"/>
+          <w:szCs w:val="24"/>
+          <w:lang w:val="en-GB"/>
+        </w:rPr>
+        <w:t>Diyin Guan</w:t>
+      </w:r>
+    </w:p>
+    <w:p>
+      <w:pPr>
+        <w:rPr>
+          <w:rFonts w:ascii="Noto Serif SC" w:eastAsia="Noto Serif SC" w:hAnsi="Noto Serif SC" w:cs="Noto Serif"/>
+          <w:sz w:val="24"/>
+          <w:szCs w:val="24"/>
+          <w:lang w:val="en-US"/>
+        </w:rPr>
+      </w:pPr>
+      <w:r>
+        <w:rPr>
+          <w:rFonts w:ascii="Noto Serif SC" w:eastAsia="Noto Serif SC" w:hAnsi="Noto Serif SC" w:cs="Noto Serif"/>
+          <w:sz w:val="24"/>
+          <w:szCs w:val="24"/>
+          <w:lang w:val="en-GB"/>
+        </w:rPr>
+        <w:t>1</w:t>
+      </w:r>
+      <w:r>
+        <w:rPr>
+          <w:rFonts w:ascii="Noto Serif SC" w:eastAsia="Noto Serif SC" w:hAnsi="Noto Serif SC" w:cs="Noto Serif" w:hint="eastAsia"/>
+          <w:sz w:val="24"/>
+          <w:szCs w:val="24"/>
+          <w:lang w:val="en-GB"/>
+        </w:rPr>
+        <w:t>倍低音加键管</w:t>
+      </w:r>
+      <w:r>
+        <w:rPr>
+          <w:rFonts w:ascii="Noto Serif SC" w:eastAsia="Noto Serif SC" w:hAnsi="Noto Serif SC" w:cs="Noto Serif"/>
+          <w:sz w:val="24"/>
+          <w:szCs w:val="24"/>
+          <w:lang w:val="en-GB"/>
+        </w:rPr>
+        <w:t xml:space="preserve"> </w:t>
+      </w:r>
+      <w:r>
+        <w:rPr>
+          <w:rFonts w:ascii="Noto Serif SC" w:eastAsia="Noto Serif SC" w:hAnsi="Noto Serif SC" w:cs="Noto Serif"/>
+          <w:sz w:val="24"/>
+          <w:szCs w:val="24"/>
+          <w:lang w:val="en-GB"/>
+        </w:rPr>
+        <w:t xml:space="preserve">1 Keyed </w:t>
+      </w:r>
+      <w:r>
+        <w:rPr>
+          <w:rFonts w:ascii="Noto Serif SC" w:eastAsia="Noto Serif SC" w:hAnsi="Noto Serif SC" w:cs="Noto Serif"/>
+          <w:sz w:val="24"/>
+          <w:szCs w:val="24"/>
+          <w:lang w:val="en-GB"/>
+        </w:rPr>
+        <w:t>Bei</w:t>
+      </w:r>
+      <w:r>
+        <w:rPr>
+          <w:rFonts w:ascii="Noto Serif SC" w:eastAsia="Noto Serif SC" w:hAnsi="Noto Serif SC" w:cs="Noto Serif"/>
+          <w:sz w:val="24"/>
+          <w:szCs w:val="24"/>
+          <w:lang w:val="en-GB"/>
+        </w:rPr>
+        <w:t>d</w:t>
+      </w:r>
+      <w:r>
+        <w:rPr>
+          <w:rFonts w:ascii="Noto Serif SC" w:eastAsia="Noto Serif SC" w:hAnsi="Noto Serif SC" w:cs="Noto Serif"/>
+          <w:sz w:val="24"/>
+          <w:szCs w:val="24"/>
+          <w:lang w:val="en-GB"/>
+        </w:rPr>
+        <w:t>iyin Guan</w:t>
+      </w:r>
+    </w:p>
+    <w:p>
+      <w:pPr>
+        <w:rPr>
+          <w:rFonts w:ascii="Noto Serif SC" w:eastAsia="Noto Serif SC" w:hAnsi="Noto Serif SC" w:cs="Noto Serif"/>
+          <w:sz w:val="24"/>
+          <w:szCs w:val="24"/>
+          <w:lang w:val="en-US"/>
+        </w:rPr>
+      </w:pPr>
+    </w:p>
+    <w:p>
+      <w:pPr>
+        <w:rPr>
+          <w:rFonts w:ascii="Noto Serif SC" w:eastAsia="Noto Serif SC" w:hAnsi="Noto Serif SC" w:cs="Noto Serif"/>
+          <w:sz w:val="24"/>
+          <w:szCs w:val="24"/>
+          <w:lang w:val="en-US"/>
+        </w:rPr>
+      </w:pPr>
+      <w:r>
+        <w:rPr>
+          <w:rFonts w:ascii="Noto Serif SC" w:eastAsia="Noto Serif SC" w:hAnsi="Noto Serif SC" w:cs="Noto Serif"/>
+          <w:sz w:val="24"/>
+          <w:szCs w:val="24"/>
+          <w:lang w:val="en-US"/>
+        </w:rPr>
+        <w:t xml:space="preserve">4 </w:t>
+      </w:r>
+      <w:r>
+        <w:rPr>
+          <w:rFonts w:ascii="Noto Serif SC" w:eastAsia="Noto Serif SC" w:hAnsi="Noto Serif SC" w:cs="Noto Serif" w:hint="eastAsia"/>
+          <w:sz w:val="24"/>
+          <w:szCs w:val="24"/>
+          <w:lang w:val="en-US"/>
+        </w:rPr>
+        <w:t>扬琴</w:t>
+      </w:r>
+      <w:r>
+        <w:rPr>
+          <w:rFonts w:ascii="Noto Serif SC" w:eastAsia="Noto Serif SC" w:hAnsi="Noto Serif SC" w:cs="Noto Serif"/>
+          <w:sz w:val="24"/>
+          <w:szCs w:val="24"/>
+          <w:lang w:val="en-US"/>
+        </w:rPr>
+        <w:t xml:space="preserve"> </w:t>
+      </w:r>
+      <w:r>
+        <w:rPr>
+          <w:rFonts w:ascii="Noto Serif SC" w:eastAsia="Noto Serif SC" w:hAnsi="Noto Serif SC" w:cs="Noto Serif"/>
+          <w:sz w:val="24"/>
+          <w:szCs w:val="24"/>
+          <w:lang w:val="en-US"/>
+        </w:rPr>
+        <w:t xml:space="preserve">2 </w:t>
+      </w:r>
+      <w:r>
+        <w:rPr>
+          <w:rFonts w:ascii="Noto Serif SC" w:eastAsia="Noto Serif SC" w:hAnsi="Noto Serif SC" w:cs="Noto Serif"/>
+          <w:sz w:val="24"/>
+          <w:szCs w:val="24"/>
+          <w:lang w:val="en-US"/>
+        </w:rPr>
+        <w:t>Yangqin</w:t>
+      </w:r>
+    </w:p>
+    <w:p>
+      <w:pPr>
+        <w:rPr>
+          <w:rFonts w:ascii="Noto Serif SC" w:eastAsia="Noto Serif SC" w:hAnsi="Noto Serif SC" w:cs="Noto Serif"/>
+          <w:sz w:val="24"/>
+          <w:szCs w:val="24"/>
+          <w:lang w:val="en-US"/>
+        </w:rPr>
+      </w:pPr>
+      <w:r>
+        <w:rPr>
+          <w:rFonts w:ascii="Noto Serif SC" w:eastAsia="Noto Serif SC" w:hAnsi="Noto Serif SC" w:cs="Noto Serif"/>
+          <w:sz w:val="24"/>
+          <w:szCs w:val="24"/>
+          <w:lang w:val="en-US"/>
+        </w:rPr>
+        <w:t xml:space="preserve">4 </w:t>
+      </w:r>
+      <w:r>
+        <w:rPr>
+          <w:rFonts w:ascii="Noto Serif SC" w:eastAsia="Noto Serif SC" w:hAnsi="Noto Serif SC" w:cs="Noto Serif" w:hint="eastAsia"/>
+          <w:sz w:val="24"/>
+          <w:szCs w:val="24"/>
+          <w:lang w:val="en-US"/>
+        </w:rPr>
+        <w:t>琵琶</w:t>
+      </w:r>
+      <w:r>
+        <w:rPr>
+          <w:rFonts w:ascii="Noto Serif SC" w:eastAsia="Noto Serif SC" w:hAnsi="Noto Serif SC" w:cs="Noto Serif"/>
+          <w:sz w:val="24"/>
+          <w:szCs w:val="24"/>
+          <w:lang w:val="en-US"/>
+        </w:rPr>
+        <w:t xml:space="preserve"> </w:t>
+      </w:r>
+      <w:r>
+        <w:rPr>
+          <w:rFonts w:ascii="Noto Serif SC" w:eastAsia="Noto Serif SC" w:hAnsi="Noto Serif SC" w:cs="Noto Serif"/>
+          <w:sz w:val="24"/>
+          <w:szCs w:val="24"/>
+          <w:lang w:val="en-US"/>
+        </w:rPr>
+        <w:t xml:space="preserve">4 </w:t>
+      </w:r>
+      <w:r>
+        <w:rPr>
+          <w:rFonts w:ascii="Noto Serif SC" w:eastAsia="Noto Serif SC" w:hAnsi="Noto Serif SC" w:cs="Noto Serif"/>
+          <w:sz w:val="24"/>
+          <w:szCs w:val="24"/>
+          <w:lang w:val="en-US"/>
+        </w:rPr>
+        <w:t>Pipa</w:t>
+      </w:r>
+    </w:p>
+    <w:p>
+      <w:pPr>
+        <w:rPr>
+          <w:rFonts w:ascii="Noto Serif SC" w:eastAsia="Noto Serif SC" w:hAnsi="Noto Serif SC" w:cs="Noto Serif"/>
+          <w:sz w:val="24"/>
+          <w:szCs w:val="24"/>
+          <w:lang w:val="en-US"/>
+        </w:rPr>
+      </w:pPr>
+      <w:r>
+        <w:rPr>
+          <w:rFonts w:ascii="Noto Serif SC" w:eastAsia="Noto Serif SC" w:hAnsi="Noto Serif SC" w:cs="Noto Serif"/>
+          <w:sz w:val="24"/>
+          <w:szCs w:val="24"/>
+          <w:lang w:val="en-GB"/>
+        </w:rPr>
+        <w:t xml:space="preserve">2 </w:t>
+      </w:r>
+      <w:r>
+        <w:rPr>
+          <w:rFonts w:ascii="Noto Serif SC" w:eastAsia="Noto Serif SC" w:hAnsi="Noto Serif SC" w:cs="Noto Serif" w:hint="eastAsia"/>
+          <w:sz w:val="24"/>
+          <w:szCs w:val="24"/>
+          <w:lang w:val="en-GB"/>
+        </w:rPr>
+        <w:t>高音阮</w:t>
+      </w:r>
+      <w:r>
+        <w:rPr>
+          <w:rFonts w:ascii="Noto Serif SC" w:eastAsia="Noto Serif SC" w:hAnsi="Noto Serif SC" w:cs="Noto Serif"/>
+          <w:sz w:val="24"/>
+          <w:szCs w:val="24"/>
+          <w:lang w:val="en-GB"/>
+        </w:rPr>
+        <w:t xml:space="preserve"> </w:t>
+      </w:r>
+      <w:r>
+        <w:rPr>
+          <w:rFonts w:ascii="Noto Serif SC" w:eastAsia="Noto Serif SC" w:hAnsi="Noto Serif SC" w:cs="Noto Serif"/>
+          <w:sz w:val="24"/>
+          <w:szCs w:val="24"/>
+          <w:lang w:val="en-GB"/>
+        </w:rPr>
+        <w:t xml:space="preserve">2 </w:t>
+      </w:r>
+      <w:r>
+        <w:rPr>
+          <w:rFonts w:ascii="Noto Serif SC" w:eastAsia="Noto Serif SC" w:hAnsi="Noto Serif SC" w:cs="Noto Serif"/>
+          <w:sz w:val="24"/>
+          <w:szCs w:val="24"/>
+          <w:lang w:val="en-GB"/>
+        </w:rPr>
+        <w:t>Gaoyin Ruan</w:t>
+      </w:r>
+    </w:p>
+    <w:p>
+      <w:pPr>
+        <w:rPr>
+          <w:rFonts w:ascii="Noto Serif SC" w:eastAsia="Noto Serif SC" w:hAnsi="Noto Serif SC" w:cs="Noto Serif"/>
+          <w:sz w:val="24"/>
+          <w:szCs w:val="24"/>
+          <w:lang w:val="en-US"/>
+        </w:rPr>
+      </w:pPr>
+      <w:r>
+        <w:rPr>
+          <w:rFonts w:ascii="Noto Serif SC" w:eastAsia="Noto Serif SC" w:hAnsi="Noto Serif SC" w:cs="Noto Serif"/>
+          <w:sz w:val="24"/>
+          <w:szCs w:val="24"/>
+          <w:lang w:val="en-US"/>
+        </w:rPr>
+        <w:t xml:space="preserve">4 </w:t>
+      </w:r>
+      <w:r>
+        <w:rPr>
+          <w:rFonts w:ascii="Noto Serif SC" w:eastAsia="Noto Serif SC" w:hAnsi="Noto Serif SC" w:cs="Noto Serif" w:hint="eastAsia"/>
+          <w:sz w:val="24"/>
+          <w:szCs w:val="24"/>
+          <w:lang w:val="en-US"/>
+        </w:rPr>
+        <w:t>中阮</w:t>
+      </w:r>
+      <w:r>
+        <w:rPr>
+          <w:rFonts w:ascii="Noto Serif SC" w:eastAsia="Noto Serif SC" w:hAnsi="Noto Serif SC" w:cs="Noto Serif"/>
+          <w:sz w:val="24"/>
+          <w:szCs w:val="24"/>
+          <w:lang w:val="en-US"/>
+        </w:rPr>
+        <w:t xml:space="preserve"> </w:t>
+      </w:r>
+      <w:r>
+        <w:rPr>
+          <w:rFonts w:ascii="Noto Serif SC" w:eastAsia="Noto Serif SC" w:hAnsi="Noto Serif SC" w:cs="Noto Serif"/>
+          <w:sz w:val="24"/>
+          <w:szCs w:val="24"/>
+          <w:lang w:val="en-US"/>
+        </w:rPr>
+        <w:t>4</w:t>
+      </w:r>
+      <w:r>
+        <w:rPr>
+          <w:rFonts w:ascii="Noto Serif SC" w:eastAsia="Noto Serif SC" w:hAnsi="Noto Serif SC" w:cs="Noto Serif"/>
+          <w:sz w:val="24"/>
+          <w:szCs w:val="24"/>
+          <w:lang w:val="en-US"/>
+        </w:rPr>
+        <w:t xml:space="preserve"> Zhongruan</w:t>
+      </w:r>
+    </w:p>
+    <w:p>
+      <w:pPr>
+        <w:rPr>
+          <w:rFonts w:ascii="Noto Serif SC" w:eastAsia="Noto Serif SC" w:hAnsi="Noto Serif SC" w:cs="Noto Serif"/>
+          <w:sz w:val="24"/>
+          <w:szCs w:val="24"/>
+          <w:lang w:val="en-US"/>
+        </w:rPr>
+      </w:pPr>
+      <w:r>
+        <w:rPr>
+          <w:rFonts w:ascii="Noto Serif SC" w:eastAsia="Noto Serif SC" w:hAnsi="Noto Serif SC" w:cs="Noto Serif"/>
+          <w:sz w:val="24"/>
+          <w:szCs w:val="24"/>
+          <w:lang w:val="en-US"/>
+        </w:rPr>
+        <w:t xml:space="preserve">2 </w:t>
+      </w:r>
+      <w:r>
+        <w:rPr>
+          <w:rFonts w:ascii="Noto Serif SC" w:eastAsia="Noto Serif SC" w:hAnsi="Noto Serif SC" w:cs="Noto Serif" w:hint="eastAsia"/>
+          <w:sz w:val="24"/>
+          <w:szCs w:val="24"/>
+          <w:lang w:val="en-US"/>
+        </w:rPr>
+        <w:t>大阮</w:t>
+      </w:r>
+      <w:r>
+        <w:rPr>
+          <w:rFonts w:ascii="Noto Serif SC" w:eastAsia="Noto Serif SC" w:hAnsi="Noto Serif SC" w:cs="Noto Serif"/>
+          <w:sz w:val="24"/>
+          <w:szCs w:val="24"/>
+          <w:lang w:val="en-US"/>
+        </w:rPr>
+        <w:t xml:space="preserve"> </w:t>
+      </w:r>
+      <w:r>
+        <w:rPr>
+          <w:rFonts w:ascii="Noto Serif SC" w:eastAsia="Noto Serif SC" w:hAnsi="Noto Serif SC" w:cs="Noto Serif"/>
+          <w:sz w:val="24"/>
+          <w:szCs w:val="24"/>
+          <w:lang w:val="en-US"/>
+        </w:rPr>
+        <w:t xml:space="preserve">2 </w:t>
+      </w:r>
+      <w:r>
+        <w:rPr>
+          <w:rFonts w:ascii="Noto Serif SC" w:eastAsia="Noto Serif SC" w:hAnsi="Noto Serif SC" w:cs="Noto Serif"/>
+          <w:sz w:val="24"/>
+          <w:szCs w:val="24"/>
+          <w:lang w:val="en-US"/>
+        </w:rPr>
+        <w:t>Daruan</w:t>
+      </w:r>
     </w:p>
     <w:p>
       <w:pPr>
@@ -2911,7 +3617,7 @@
           <w:szCs w:val="24"/>
           <w:lang w:val="en-US"/>
         </w:rPr>
-        <w:t>曲笛</w:t>
+        <w:t>古筝</w:t>
       </w:r>
       <w:r>
         <w:rPr>
@@ -2931,1023 +3637,6 @@
         </w:rPr>
         <w:t xml:space="preserve">1 </w:t>
       </w:r>
-      <w:proofErr w:type="spellStart"/>
-      <w:r>
-        <w:rPr>
-          <w:rFonts w:ascii="Noto Serif SC" w:eastAsia="Noto Serif SC" w:hAnsi="Noto Serif SC" w:cs="Noto Serif"/>
-          <w:sz w:val="24"/>
-          <w:szCs w:val="24"/>
-          <w:lang w:val="en-US"/>
-        </w:rPr>
-        <w:t>Qudi</w:t>
-      </w:r>
-      <w:proofErr w:type="spellEnd"/>
-    </w:p>
-    <w:p>
-      <w:pPr>
-        <w:spacing w:after="120"/>
-        <w:rPr>
-          <w:rFonts w:ascii="Noto Serif SC" w:eastAsia="Noto Serif SC" w:hAnsi="Noto Serif SC" w:cs="Noto Serif"/>
-          <w:sz w:val="24"/>
-          <w:szCs w:val="24"/>
-          <w:lang w:val="en-US"/>
-        </w:rPr>
-      </w:pPr>
-      <w:r>
-        <w:rPr>
-          <w:rFonts w:ascii="Noto Serif SC" w:eastAsia="Noto Serif SC" w:hAnsi="Noto Serif SC" w:cs="Noto Serif"/>
-          <w:sz w:val="24"/>
-          <w:szCs w:val="24"/>
-          <w:lang w:val="en-US"/>
-        </w:rPr>
-        <w:t xml:space="preserve">2 </w:t>
-      </w:r>
-      <w:r>
-        <w:rPr>
-          <w:rFonts w:ascii="Noto Serif SC" w:eastAsia="Noto Serif SC" w:hAnsi="Noto Serif SC" w:cs="Noto Serif" w:hint="eastAsia"/>
-          <w:sz w:val="24"/>
-          <w:szCs w:val="24"/>
-          <w:lang w:val="en-US"/>
-        </w:rPr>
-        <w:t>新笛</w:t>
-      </w:r>
-      <w:r>
-        <w:rPr>
-          <w:rFonts w:ascii="Noto Serif SC" w:eastAsia="Noto Serif SC" w:hAnsi="Noto Serif SC" w:cs="Noto Serif"/>
-          <w:sz w:val="24"/>
-          <w:szCs w:val="24"/>
-          <w:lang w:val="en-US"/>
-        </w:rPr>
-        <w:t xml:space="preserve"> </w:t>
-      </w:r>
-      <w:r>
-        <w:rPr>
-          <w:rFonts w:ascii="Noto Serif SC" w:eastAsia="Noto Serif SC" w:hAnsi="Noto Serif SC" w:cs="Noto Serif"/>
-          <w:sz w:val="24"/>
-          <w:szCs w:val="24"/>
-          <w:lang w:val="en-US"/>
-        </w:rPr>
-        <w:t xml:space="preserve">2 </w:t>
-      </w:r>
-      <w:proofErr w:type="spellStart"/>
-      <w:r>
-        <w:rPr>
-          <w:rFonts w:ascii="Noto Serif SC" w:eastAsia="Noto Serif SC" w:hAnsi="Noto Serif SC" w:cs="Noto Serif"/>
-          <w:sz w:val="24"/>
-          <w:szCs w:val="24"/>
-          <w:lang w:val="en-US"/>
-        </w:rPr>
-        <w:t>Xindi</w:t>
-      </w:r>
-      <w:proofErr w:type="spellEnd"/>
-    </w:p>
-    <w:p>
-      <w:pPr>
-        <w:rPr>
-          <w:rFonts w:ascii="Noto Serif SC" w:eastAsia="Noto Serif SC" w:hAnsi="Noto Serif SC" w:cs="Noto Serif"/>
-          <w:sz w:val="24"/>
-          <w:szCs w:val="24"/>
-          <w:lang w:val="en-US"/>
-        </w:rPr>
-      </w:pPr>
-      <w:r>
-        <w:rPr>
-          <w:rFonts w:ascii="Noto Serif SC" w:eastAsia="Noto Serif SC" w:hAnsi="Noto Serif SC" w:cs="Noto Serif"/>
-          <w:sz w:val="24"/>
-          <w:szCs w:val="24"/>
-          <w:lang w:val="en-US"/>
-        </w:rPr>
-        <w:t xml:space="preserve">2 </w:t>
-      </w:r>
-      <w:r>
-        <w:rPr>
-          <w:rFonts w:ascii="Noto Serif SC" w:eastAsia="Noto Serif SC" w:hAnsi="Noto Serif SC" w:cs="Noto Serif" w:hint="eastAsia"/>
-          <w:sz w:val="24"/>
-          <w:szCs w:val="24"/>
-          <w:lang w:val="en-US"/>
-        </w:rPr>
-        <w:t>高音笙</w:t>
-      </w:r>
-      <w:r>
-        <w:rPr>
-          <w:rFonts w:ascii="Noto Serif SC" w:eastAsia="Noto Serif SC" w:hAnsi="Noto Serif SC" w:cs="Noto Serif"/>
-          <w:sz w:val="24"/>
-          <w:szCs w:val="24"/>
-          <w:lang w:val="en-US"/>
-        </w:rPr>
-        <w:t xml:space="preserve"> </w:t>
-      </w:r>
-      <w:r>
-        <w:rPr>
-          <w:rFonts w:ascii="Noto Serif SC" w:eastAsia="Noto Serif SC" w:hAnsi="Noto Serif SC" w:cs="Noto Serif"/>
-          <w:sz w:val="24"/>
-          <w:szCs w:val="24"/>
-          <w:lang w:val="en-US"/>
-        </w:rPr>
-        <w:t xml:space="preserve">2 </w:t>
-      </w:r>
-      <w:proofErr w:type="spellStart"/>
-      <w:r>
-        <w:rPr>
-          <w:rFonts w:ascii="Noto Serif SC" w:eastAsia="Noto Serif SC" w:hAnsi="Noto Serif SC" w:cs="Noto Serif"/>
-          <w:sz w:val="24"/>
-          <w:szCs w:val="24"/>
-          <w:lang w:val="en-US"/>
-        </w:rPr>
-        <w:t>Gaoyin</w:t>
-      </w:r>
-      <w:proofErr w:type="spellEnd"/>
-      <w:r>
-        <w:rPr>
-          <w:rFonts w:ascii="Noto Serif SC" w:eastAsia="Noto Serif SC" w:hAnsi="Noto Serif SC" w:cs="Noto Serif"/>
-          <w:sz w:val="24"/>
-          <w:szCs w:val="24"/>
-          <w:lang w:val="en-US"/>
-        </w:rPr>
-        <w:t xml:space="preserve"> Sheng</w:t>
-      </w:r>
-    </w:p>
-    <w:p>
-      <w:pPr>
-        <w:rPr>
-          <w:rFonts w:ascii="Noto Serif SC" w:eastAsia="Noto Serif SC" w:hAnsi="Noto Serif SC" w:cs="Noto Serif"/>
-          <w:sz w:val="24"/>
-          <w:szCs w:val="24"/>
-          <w:lang w:val="en-US"/>
-        </w:rPr>
-      </w:pPr>
-      <w:r>
-        <w:rPr>
-          <w:rFonts w:ascii="Noto Serif SC" w:eastAsia="Noto Serif SC" w:hAnsi="Noto Serif SC" w:cs="Noto Serif"/>
-          <w:sz w:val="24"/>
-          <w:szCs w:val="24"/>
-          <w:lang w:val="en-US"/>
-        </w:rPr>
-        <w:t xml:space="preserve">2 </w:t>
-      </w:r>
-      <w:r>
-        <w:rPr>
-          <w:rFonts w:ascii="Noto Serif SC" w:eastAsia="Noto Serif SC" w:hAnsi="Noto Serif SC" w:cs="Noto Serif" w:hint="eastAsia"/>
-          <w:sz w:val="24"/>
-          <w:szCs w:val="24"/>
-          <w:lang w:val="en-US"/>
-        </w:rPr>
-        <w:t>中音笙</w:t>
-      </w:r>
-      <w:r>
-        <w:rPr>
-          <w:rFonts w:ascii="Noto Serif SC" w:eastAsia="Noto Serif SC" w:hAnsi="Noto Serif SC" w:cs="Noto Serif"/>
-          <w:sz w:val="24"/>
-          <w:szCs w:val="24"/>
-          <w:lang w:val="en-US"/>
-        </w:rPr>
-        <w:t xml:space="preserve"> </w:t>
-      </w:r>
-      <w:r>
-        <w:rPr>
-          <w:rFonts w:ascii="Noto Serif SC" w:eastAsia="Noto Serif SC" w:hAnsi="Noto Serif SC" w:cs="Noto Serif"/>
-          <w:sz w:val="24"/>
-          <w:szCs w:val="24"/>
-          <w:lang w:val="en-US"/>
-        </w:rPr>
-        <w:t xml:space="preserve">2 </w:t>
-      </w:r>
-      <w:proofErr w:type="spellStart"/>
-      <w:r>
-        <w:rPr>
-          <w:rFonts w:ascii="Noto Serif SC" w:eastAsia="Noto Serif SC" w:hAnsi="Noto Serif SC" w:cs="Noto Serif"/>
-          <w:sz w:val="24"/>
-          <w:szCs w:val="24"/>
-          <w:lang w:val="en-US"/>
-        </w:rPr>
-        <w:t>Zhongyin</w:t>
-      </w:r>
-      <w:proofErr w:type="spellEnd"/>
-      <w:r>
-        <w:rPr>
-          <w:rFonts w:ascii="Noto Serif SC" w:eastAsia="Noto Serif SC" w:hAnsi="Noto Serif SC" w:cs="Noto Serif"/>
-          <w:sz w:val="24"/>
-          <w:szCs w:val="24"/>
-          <w:lang w:val="en-US"/>
-        </w:rPr>
-        <w:t xml:space="preserve"> Sheng</w:t>
-      </w:r>
-    </w:p>
-    <w:p>
-      <w:pPr>
-        <w:spacing w:after="120"/>
-        <w:rPr>
-          <w:rFonts w:ascii="Noto Serif SC" w:eastAsia="Noto Serif SC" w:hAnsi="Noto Serif SC" w:cs="Noto Serif"/>
-          <w:sz w:val="24"/>
-          <w:szCs w:val="24"/>
-          <w:lang w:val="en-US"/>
-        </w:rPr>
-      </w:pPr>
-      <w:r>
-        <w:rPr>
-          <w:rFonts w:ascii="Noto Serif SC" w:eastAsia="Noto Serif SC" w:hAnsi="Noto Serif SC" w:cs="Noto Serif"/>
-          <w:sz w:val="24"/>
-          <w:szCs w:val="24"/>
-          <w:lang w:val="en-US"/>
-        </w:rPr>
-        <w:t xml:space="preserve">1 </w:t>
-      </w:r>
-      <w:r>
-        <w:rPr>
-          <w:rFonts w:ascii="Noto Serif SC" w:eastAsia="Noto Serif SC" w:hAnsi="Noto Serif SC" w:cs="Noto Serif" w:hint="eastAsia"/>
-          <w:sz w:val="24"/>
-          <w:szCs w:val="24"/>
-          <w:lang w:val="en-US"/>
-        </w:rPr>
-        <w:t>低音笙</w:t>
-      </w:r>
-      <w:r>
-        <w:rPr>
-          <w:rFonts w:ascii="Noto Serif SC" w:eastAsia="Noto Serif SC" w:hAnsi="Noto Serif SC" w:cs="Noto Serif"/>
-          <w:sz w:val="24"/>
-          <w:szCs w:val="24"/>
-          <w:lang w:val="en-US"/>
-        </w:rPr>
-        <w:t xml:space="preserve"> 1 Diyin Sheng</w:t>
-      </w:r>
-    </w:p>
-    <w:p>
-      <w:pPr>
-        <w:rPr>
-          <w:rFonts w:ascii="Noto Serif SC" w:eastAsia="Noto Serif SC" w:hAnsi="Noto Serif SC" w:cs="Noto Serif"/>
-          <w:sz w:val="24"/>
-          <w:szCs w:val="24"/>
-          <w:lang w:val="en-US"/>
-        </w:rPr>
-      </w:pPr>
-      <w:r>
-        <w:rPr>
-          <w:rFonts w:ascii="Noto Serif SC" w:eastAsia="Noto Serif SC" w:hAnsi="Noto Serif SC" w:cs="Noto Serif"/>
-          <w:sz w:val="24"/>
-          <w:szCs w:val="24"/>
-          <w:lang w:val="en-US"/>
-        </w:rPr>
-        <w:t xml:space="preserve">2 </w:t>
-      </w:r>
-      <w:r>
-        <w:rPr>
-          <w:rFonts w:ascii="Noto Serif SC" w:eastAsia="Noto Serif SC" w:hAnsi="Noto Serif SC" w:cs="Noto Serif" w:hint="eastAsia"/>
-          <w:sz w:val="24"/>
-          <w:szCs w:val="24"/>
-          <w:lang w:val="en-US"/>
-        </w:rPr>
-        <w:t>高音加键唢吶</w:t>
-      </w:r>
-      <w:r>
-        <w:rPr>
-          <w:rFonts w:ascii="Noto Serif SC" w:eastAsia="Noto Serif SC" w:hAnsi="Noto Serif SC" w:cs="Noto Serif"/>
-          <w:sz w:val="24"/>
-          <w:szCs w:val="24"/>
-          <w:lang w:val="en-US"/>
-        </w:rPr>
-        <w:t xml:space="preserve"> </w:t>
-      </w:r>
-      <w:r>
-        <w:rPr>
-          <w:rFonts w:ascii="Noto Serif SC" w:eastAsia="Noto Serif SC" w:hAnsi="Noto Serif SC" w:cs="Noto Serif"/>
-          <w:sz w:val="24"/>
-          <w:szCs w:val="24"/>
-          <w:lang w:val="en-US"/>
-        </w:rPr>
-        <w:t xml:space="preserve">2 </w:t>
-      </w:r>
-      <w:proofErr w:type="spellStart"/>
-      <w:r>
-        <w:rPr>
-          <w:rFonts w:ascii="Noto Serif SC" w:eastAsia="Noto Serif SC" w:hAnsi="Noto Serif SC" w:cs="Noto Serif"/>
-          <w:sz w:val="24"/>
-          <w:szCs w:val="24"/>
-          <w:lang w:val="en-US"/>
-        </w:rPr>
-        <w:t>Gaoyin</w:t>
-      </w:r>
-      <w:proofErr w:type="spellEnd"/>
-      <w:r>
-        <w:rPr>
-          <w:rFonts w:ascii="Noto Serif SC" w:eastAsia="Noto Serif SC" w:hAnsi="Noto Serif SC" w:cs="Noto Serif"/>
-          <w:sz w:val="24"/>
-          <w:szCs w:val="24"/>
-          <w:lang w:val="en-US"/>
-        </w:rPr>
-        <w:t xml:space="preserve"> </w:t>
-      </w:r>
-      <w:proofErr w:type="spellStart"/>
-      <w:r>
-        <w:rPr>
-          <w:rFonts w:ascii="Noto Serif SC" w:eastAsia="Noto Serif SC" w:hAnsi="Noto Serif SC" w:cs="Noto Serif"/>
-          <w:sz w:val="24"/>
-          <w:szCs w:val="24"/>
-          <w:lang w:val="en-US"/>
-        </w:rPr>
-        <w:t>Suona</w:t>
-      </w:r>
-      <w:proofErr w:type="spellEnd"/>
-    </w:p>
-    <w:p>
-      <w:pPr>
-        <w:rPr>
-          <w:rFonts w:ascii="Noto Serif SC" w:eastAsia="Noto Serif SC" w:hAnsi="Noto Serif SC" w:cs="Noto Serif"/>
-          <w:sz w:val="24"/>
-          <w:szCs w:val="24"/>
-          <w:lang w:val="en-US"/>
-        </w:rPr>
-      </w:pPr>
-      <w:r>
-        <w:rPr>
-          <w:rFonts w:ascii="Noto Serif SC" w:eastAsia="Noto Serif SC" w:hAnsi="Noto Serif SC" w:cs="Noto Serif"/>
-          <w:sz w:val="24"/>
-          <w:szCs w:val="24"/>
-          <w:lang w:val="en-US"/>
-        </w:rPr>
-        <w:t>1</w:t>
-      </w:r>
-      <w:r>
-        <w:rPr>
-          <w:rFonts w:ascii="Noto Serif SC" w:eastAsia="Noto Serif SC" w:hAnsi="Noto Serif SC" w:cs="Noto Serif" w:hint="eastAsia"/>
-          <w:sz w:val="24"/>
-          <w:szCs w:val="24"/>
-          <w:lang w:val="en-US"/>
-        </w:rPr>
-        <w:t>中音加键唢吶</w:t>
-      </w:r>
-      <w:r>
-        <w:rPr>
-          <w:rFonts w:ascii="Noto Serif SC" w:eastAsia="Noto Serif SC" w:hAnsi="Noto Serif SC" w:cs="Noto Serif"/>
-          <w:sz w:val="24"/>
-          <w:szCs w:val="24"/>
-          <w:lang w:val="en-US"/>
-        </w:rPr>
-        <w:t xml:space="preserve"> </w:t>
-      </w:r>
-      <w:r>
-        <w:rPr>
-          <w:rFonts w:ascii="Noto Serif SC" w:eastAsia="Noto Serif SC" w:hAnsi="Noto Serif SC" w:cs="Noto Serif"/>
-          <w:sz w:val="24"/>
-          <w:szCs w:val="24"/>
-          <w:lang w:val="en-US"/>
-        </w:rPr>
-        <w:t xml:space="preserve">1 </w:t>
-      </w:r>
-      <w:proofErr w:type="spellStart"/>
-      <w:r>
-        <w:rPr>
-          <w:rFonts w:ascii="Noto Serif SC" w:eastAsia="Noto Serif SC" w:hAnsi="Noto Serif SC" w:cs="Noto Serif"/>
-          <w:sz w:val="24"/>
-          <w:szCs w:val="24"/>
-          <w:lang w:val="en-US"/>
-        </w:rPr>
-        <w:t>Zhongyin</w:t>
-      </w:r>
-      <w:proofErr w:type="spellEnd"/>
-      <w:r>
-        <w:rPr>
-          <w:rFonts w:ascii="Noto Serif SC" w:eastAsia="Noto Serif SC" w:hAnsi="Noto Serif SC" w:cs="Noto Serif"/>
-          <w:sz w:val="24"/>
-          <w:szCs w:val="24"/>
-          <w:lang w:val="en-US"/>
-        </w:rPr>
-        <w:t xml:space="preserve"> </w:t>
-      </w:r>
-      <w:proofErr w:type="spellStart"/>
-      <w:r>
-        <w:rPr>
-          <w:rFonts w:ascii="Noto Serif SC" w:eastAsia="Noto Serif SC" w:hAnsi="Noto Serif SC" w:cs="Noto Serif"/>
-          <w:sz w:val="24"/>
-          <w:szCs w:val="24"/>
-          <w:lang w:val="en-US"/>
-        </w:rPr>
-        <w:t>Suona</w:t>
-      </w:r>
-      <w:proofErr w:type="spellEnd"/>
-    </w:p>
-    <w:p>
-      <w:pPr>
-        <w:rPr>
-          <w:rFonts w:ascii="Noto Serif SC" w:eastAsia="Noto Serif SC" w:hAnsi="Noto Serif SC" w:cs="Noto Serif"/>
-          <w:sz w:val="24"/>
-          <w:szCs w:val="24"/>
-          <w:lang w:val="en-US"/>
-        </w:rPr>
-      </w:pPr>
-      <w:r>
-        <w:rPr>
-          <w:rFonts w:ascii="Noto Serif SC" w:eastAsia="Noto Serif SC" w:hAnsi="Noto Serif SC" w:cs="Noto Serif"/>
-          <w:sz w:val="24"/>
-          <w:szCs w:val="24"/>
-          <w:lang w:val="en-US"/>
-        </w:rPr>
-        <w:t>1</w:t>
-      </w:r>
-      <w:r>
-        <w:rPr>
-          <w:rFonts w:ascii="Noto Serif SC" w:eastAsia="Noto Serif SC" w:hAnsi="Noto Serif SC" w:cs="Noto Serif" w:hint="eastAsia"/>
-          <w:sz w:val="24"/>
-          <w:szCs w:val="24"/>
-          <w:lang w:val="en-US"/>
-        </w:rPr>
-        <w:t>低音加键唢吶</w:t>
-      </w:r>
-      <w:r>
-        <w:rPr>
-          <w:rFonts w:ascii="Noto Serif SC" w:eastAsia="Noto Serif SC" w:hAnsi="Noto Serif SC" w:cs="Noto Serif"/>
-          <w:sz w:val="24"/>
-          <w:szCs w:val="24"/>
-          <w:lang w:val="en-US"/>
-        </w:rPr>
-        <w:t xml:space="preserve"> </w:t>
-      </w:r>
-      <w:r>
-        <w:rPr>
-          <w:rFonts w:ascii="Noto Serif SC" w:eastAsia="Noto Serif SC" w:hAnsi="Noto Serif SC" w:cs="Noto Serif"/>
-          <w:sz w:val="24"/>
-          <w:szCs w:val="24"/>
-          <w:lang w:val="en-US"/>
-        </w:rPr>
-        <w:t xml:space="preserve">1 </w:t>
-      </w:r>
-      <w:proofErr w:type="spellStart"/>
-      <w:r>
-        <w:rPr>
-          <w:rFonts w:ascii="Noto Serif SC" w:eastAsia="Noto Serif SC" w:hAnsi="Noto Serif SC" w:cs="Noto Serif"/>
-          <w:sz w:val="24"/>
-          <w:szCs w:val="24"/>
-          <w:lang w:val="en-US"/>
-        </w:rPr>
-        <w:t>Diyin</w:t>
-      </w:r>
-      <w:proofErr w:type="spellEnd"/>
-      <w:r>
-        <w:rPr>
-          <w:rFonts w:ascii="Noto Serif SC" w:eastAsia="Noto Serif SC" w:hAnsi="Noto Serif SC" w:cs="Noto Serif"/>
-          <w:sz w:val="24"/>
-          <w:szCs w:val="24"/>
-          <w:lang w:val="en-US"/>
-        </w:rPr>
-        <w:t xml:space="preserve"> </w:t>
-      </w:r>
-      <w:proofErr w:type="spellStart"/>
-      <w:r>
-        <w:rPr>
-          <w:rFonts w:ascii="Noto Serif SC" w:eastAsia="Noto Serif SC" w:hAnsi="Noto Serif SC" w:cs="Noto Serif"/>
-          <w:sz w:val="24"/>
-          <w:szCs w:val="24"/>
-          <w:lang w:val="en-US"/>
-        </w:rPr>
-        <w:t>Suona</w:t>
-      </w:r>
-      <w:proofErr w:type="spellEnd"/>
-    </w:p>
-    <w:p>
-      <w:pPr>
-        <w:rPr>
-          <w:rFonts w:ascii="Noto Serif SC" w:eastAsia="Noto Serif SC" w:hAnsi="Noto Serif SC" w:cs="Noto Serif"/>
-          <w:sz w:val="24"/>
-          <w:szCs w:val="24"/>
-          <w:lang w:val="en-GB"/>
-        </w:rPr>
-      </w:pPr>
-      <w:r>
-        <w:rPr>
-          <w:rFonts w:ascii="Noto Serif SC" w:eastAsia="Noto Serif SC" w:hAnsi="Noto Serif SC" w:cs="Noto Serif"/>
-          <w:sz w:val="24"/>
-          <w:szCs w:val="24"/>
-          <w:lang w:val="en-GB"/>
-        </w:rPr>
-        <w:t>1</w:t>
-      </w:r>
-      <w:r>
-        <w:rPr>
-          <w:rFonts w:ascii="Noto Serif SC" w:eastAsia="Noto Serif SC" w:hAnsi="Noto Serif SC" w:cs="Noto Serif" w:hint="eastAsia"/>
-          <w:sz w:val="24"/>
-          <w:szCs w:val="24"/>
-          <w:lang w:val="en-GB"/>
-        </w:rPr>
-        <w:t>中音加键管</w:t>
-      </w:r>
-      <w:r>
-        <w:rPr>
-          <w:rFonts w:ascii="Noto Serif SC" w:eastAsia="Noto Serif SC" w:hAnsi="Noto Serif SC" w:cs="Noto Serif"/>
-          <w:sz w:val="24"/>
-          <w:szCs w:val="24"/>
-          <w:lang w:val="en-GB"/>
-        </w:rPr>
-        <w:t xml:space="preserve"> </w:t>
-      </w:r>
-      <w:r>
-        <w:rPr>
-          <w:rFonts w:ascii="Noto Serif SC" w:eastAsia="Noto Serif SC" w:hAnsi="Noto Serif SC" w:cs="Noto Serif"/>
-          <w:sz w:val="24"/>
-          <w:szCs w:val="24"/>
-          <w:lang w:val="en-GB"/>
-        </w:rPr>
-        <w:t xml:space="preserve">1 Keyed </w:t>
-      </w:r>
-      <w:proofErr w:type="spellStart"/>
-      <w:r>
-        <w:rPr>
-          <w:rFonts w:ascii="Noto Serif SC" w:eastAsia="Noto Serif SC" w:hAnsi="Noto Serif SC" w:cs="Noto Serif"/>
-          <w:sz w:val="24"/>
-          <w:szCs w:val="24"/>
-          <w:lang w:val="en-GB"/>
-        </w:rPr>
-        <w:t>Zhongyin</w:t>
-      </w:r>
-      <w:proofErr w:type="spellEnd"/>
-      <w:r>
-        <w:rPr>
-          <w:rFonts w:ascii="Noto Serif SC" w:eastAsia="Noto Serif SC" w:hAnsi="Noto Serif SC" w:cs="Noto Serif"/>
-          <w:sz w:val="24"/>
-          <w:szCs w:val="24"/>
-          <w:lang w:val="en-GB"/>
-        </w:rPr>
-        <w:t xml:space="preserve"> Guan</w:t>
-      </w:r>
-    </w:p>
-    <w:p>
-      <w:pPr>
-        <w:rPr>
-          <w:rFonts w:ascii="Noto Serif SC" w:eastAsia="Noto Serif SC" w:hAnsi="Noto Serif SC" w:cs="Noto Serif"/>
-          <w:sz w:val="24"/>
-          <w:szCs w:val="24"/>
-          <w:lang w:val="en-GB"/>
-        </w:rPr>
-      </w:pPr>
-      <w:r>
-        <w:rPr>
-          <w:rFonts w:ascii="Noto Serif SC" w:eastAsia="Noto Serif SC" w:hAnsi="Noto Serif SC" w:cs="Noto Serif"/>
-          <w:sz w:val="24"/>
-          <w:szCs w:val="24"/>
-          <w:lang w:val="en-GB"/>
-        </w:rPr>
-        <w:t>1</w:t>
-      </w:r>
-      <w:r>
-        <w:rPr>
-          <w:rFonts w:ascii="Noto Serif SC" w:eastAsia="Noto Serif SC" w:hAnsi="Noto Serif SC" w:cs="Noto Serif" w:hint="eastAsia"/>
-          <w:sz w:val="24"/>
-          <w:szCs w:val="24"/>
-          <w:lang w:val="en-GB"/>
-        </w:rPr>
-        <w:t>低音加键管</w:t>
-      </w:r>
-      <w:r>
-        <w:rPr>
-          <w:rFonts w:ascii="Noto Serif SC" w:eastAsia="Noto Serif SC" w:hAnsi="Noto Serif SC" w:cs="Noto Serif"/>
-          <w:sz w:val="24"/>
-          <w:szCs w:val="24"/>
-          <w:lang w:val="en-GB"/>
-        </w:rPr>
-        <w:t xml:space="preserve"> </w:t>
-      </w:r>
-      <w:r>
-        <w:rPr>
-          <w:rFonts w:ascii="Noto Serif SC" w:eastAsia="Noto Serif SC" w:hAnsi="Noto Serif SC" w:cs="Noto Serif"/>
-          <w:sz w:val="24"/>
-          <w:szCs w:val="24"/>
-          <w:lang w:val="en-GB"/>
-        </w:rPr>
-        <w:t xml:space="preserve">1 Keyed </w:t>
-      </w:r>
-      <w:r>
-        <w:rPr>
-          <w:rFonts w:ascii="Noto Serif SC" w:eastAsia="Noto Serif SC" w:hAnsi="Noto Serif SC" w:cs="Noto Serif"/>
-          <w:sz w:val="24"/>
-          <w:szCs w:val="24"/>
-          <w:lang w:val="en-GB"/>
-        </w:rPr>
-        <w:t>Diyin Guan</w:t>
-      </w:r>
-    </w:p>
-    <w:p>
-      <w:pPr>
-        <w:rPr>
-          <w:rFonts w:ascii="Noto Serif SC" w:eastAsia="Noto Serif SC" w:hAnsi="Noto Serif SC" w:cs="Noto Serif"/>
-          <w:sz w:val="24"/>
-          <w:szCs w:val="24"/>
-          <w:lang w:val="en-US"/>
-        </w:rPr>
-      </w:pPr>
-      <w:r>
-        <w:rPr>
-          <w:rFonts w:ascii="Noto Serif SC" w:eastAsia="Noto Serif SC" w:hAnsi="Noto Serif SC" w:cs="Noto Serif"/>
-          <w:sz w:val="24"/>
-          <w:szCs w:val="24"/>
-          <w:lang w:val="en-GB"/>
-        </w:rPr>
-        <w:t>1</w:t>
-      </w:r>
-      <w:r>
-        <w:rPr>
-          <w:rFonts w:ascii="Noto Serif SC" w:eastAsia="Noto Serif SC" w:hAnsi="Noto Serif SC" w:cs="Noto Serif" w:hint="eastAsia"/>
-          <w:sz w:val="24"/>
-          <w:szCs w:val="24"/>
-          <w:lang w:val="en-GB"/>
-        </w:rPr>
-        <w:t>倍低音加键管</w:t>
-      </w:r>
-      <w:r>
-        <w:rPr>
-          <w:rFonts w:ascii="Noto Serif SC" w:eastAsia="Noto Serif SC" w:hAnsi="Noto Serif SC" w:cs="Noto Serif"/>
-          <w:sz w:val="24"/>
-          <w:szCs w:val="24"/>
-          <w:lang w:val="en-GB"/>
-        </w:rPr>
-        <w:t xml:space="preserve"> </w:t>
-      </w:r>
-      <w:r>
-        <w:rPr>
-          <w:rFonts w:ascii="Noto Serif SC" w:eastAsia="Noto Serif SC" w:hAnsi="Noto Serif SC" w:cs="Noto Serif"/>
-          <w:sz w:val="24"/>
-          <w:szCs w:val="24"/>
-          <w:lang w:val="en-GB"/>
-        </w:rPr>
-        <w:t xml:space="preserve">1 Keyed </w:t>
-      </w:r>
-      <w:proofErr w:type="spellStart"/>
-      <w:r>
-        <w:rPr>
-          <w:rFonts w:ascii="Noto Serif SC" w:eastAsia="Noto Serif SC" w:hAnsi="Noto Serif SC" w:cs="Noto Serif"/>
-          <w:sz w:val="24"/>
-          <w:szCs w:val="24"/>
-          <w:lang w:val="en-GB"/>
-        </w:rPr>
-        <w:t>Bei</w:t>
-      </w:r>
-      <w:r>
-        <w:rPr>
-          <w:rFonts w:ascii="Noto Serif SC" w:eastAsia="Noto Serif SC" w:hAnsi="Noto Serif SC" w:cs="Noto Serif"/>
-          <w:sz w:val="24"/>
-          <w:szCs w:val="24"/>
-          <w:lang w:val="en-GB"/>
-        </w:rPr>
-        <w:t>d</w:t>
-      </w:r>
-      <w:r>
-        <w:rPr>
-          <w:rFonts w:ascii="Noto Serif SC" w:eastAsia="Noto Serif SC" w:hAnsi="Noto Serif SC" w:cs="Noto Serif"/>
-          <w:sz w:val="24"/>
-          <w:szCs w:val="24"/>
-          <w:lang w:val="en-GB"/>
-        </w:rPr>
-        <w:t>iyin</w:t>
-      </w:r>
-      <w:proofErr w:type="spellEnd"/>
-      <w:r>
-        <w:rPr>
-          <w:rFonts w:ascii="Noto Serif SC" w:eastAsia="Noto Serif SC" w:hAnsi="Noto Serif SC" w:cs="Noto Serif"/>
-          <w:sz w:val="24"/>
-          <w:szCs w:val="24"/>
-          <w:lang w:val="en-GB"/>
-        </w:rPr>
-        <w:t xml:space="preserve"> Guan</w:t>
-      </w:r>
-    </w:p>
-    <w:p>
-      <w:pPr>
-        <w:rPr>
-          <w:rFonts w:ascii="Noto Serif SC" w:eastAsia="Noto Serif SC" w:hAnsi="Noto Serif SC" w:cs="Noto Serif"/>
-          <w:sz w:val="24"/>
-          <w:szCs w:val="24"/>
-          <w:lang w:val="en-US"/>
-        </w:rPr>
-      </w:pPr>
-    </w:p>
-    <w:p>
-      <w:pPr>
-        <w:rPr>
-          <w:rFonts w:ascii="Noto Serif SC" w:eastAsia="Noto Serif SC" w:hAnsi="Noto Serif SC" w:cs="Noto Serif"/>
-          <w:sz w:val="24"/>
-          <w:szCs w:val="24"/>
-          <w:lang w:val="en-US"/>
-        </w:rPr>
-      </w:pPr>
-      <w:r>
-        <w:rPr>
-          <w:rFonts w:ascii="Noto Serif SC" w:eastAsia="Noto Serif SC" w:hAnsi="Noto Serif SC" w:cs="Noto Serif"/>
-          <w:sz w:val="24"/>
-          <w:szCs w:val="24"/>
-          <w:lang w:val="en-US"/>
-        </w:rPr>
-        <w:t xml:space="preserve">4 </w:t>
-      </w:r>
-      <w:r>
-        <w:rPr>
-          <w:rFonts w:ascii="Noto Serif SC" w:eastAsia="Noto Serif SC" w:hAnsi="Noto Serif SC" w:cs="Noto Serif" w:hint="eastAsia"/>
-          <w:sz w:val="24"/>
-          <w:szCs w:val="24"/>
-          <w:lang w:val="en-US"/>
-        </w:rPr>
-        <w:t>扬琴</w:t>
-      </w:r>
-      <w:r>
-        <w:rPr>
-          <w:rFonts w:ascii="Noto Serif SC" w:eastAsia="Noto Serif SC" w:hAnsi="Noto Serif SC" w:cs="Noto Serif"/>
-          <w:sz w:val="24"/>
-          <w:szCs w:val="24"/>
-          <w:lang w:val="en-US"/>
-        </w:rPr>
-        <w:t xml:space="preserve"> </w:t>
-      </w:r>
-      <w:r>
-        <w:rPr>
-          <w:rFonts w:ascii="Noto Serif SC" w:eastAsia="Noto Serif SC" w:hAnsi="Noto Serif SC" w:cs="Noto Serif"/>
-          <w:sz w:val="24"/>
-          <w:szCs w:val="24"/>
-          <w:lang w:val="en-US"/>
-        </w:rPr>
-        <w:t xml:space="preserve">2 </w:t>
-      </w:r>
-      <w:r>
-        <w:rPr>
-          <w:rFonts w:ascii="Noto Serif SC" w:eastAsia="Noto Serif SC" w:hAnsi="Noto Serif SC" w:cs="Noto Serif"/>
-          <w:sz w:val="24"/>
-          <w:szCs w:val="24"/>
-          <w:lang w:val="en-US"/>
-        </w:rPr>
-        <w:t>Yangqin</w:t>
-      </w:r>
-    </w:p>
-    <w:p>
-      <w:pPr>
-        <w:rPr>
-          <w:rFonts w:ascii="Noto Serif SC" w:eastAsia="Noto Serif SC" w:hAnsi="Noto Serif SC" w:cs="Noto Serif"/>
-          <w:sz w:val="24"/>
-          <w:szCs w:val="24"/>
-          <w:lang w:val="en-US"/>
-        </w:rPr>
-      </w:pPr>
-      <w:r>
-        <w:rPr>
-          <w:rFonts w:ascii="Noto Serif SC" w:eastAsia="Noto Serif SC" w:hAnsi="Noto Serif SC" w:cs="Noto Serif"/>
-          <w:sz w:val="24"/>
-          <w:szCs w:val="24"/>
-          <w:lang w:val="en-US"/>
-        </w:rPr>
-        <w:t xml:space="preserve">4 </w:t>
-      </w:r>
-      <w:r>
-        <w:rPr>
-          <w:rFonts w:ascii="Noto Serif SC" w:eastAsia="Noto Serif SC" w:hAnsi="Noto Serif SC" w:cs="Noto Serif" w:hint="eastAsia"/>
-          <w:sz w:val="24"/>
-          <w:szCs w:val="24"/>
-          <w:lang w:val="en-US"/>
-        </w:rPr>
-        <w:t>琵琶</w:t>
-      </w:r>
-      <w:r>
-        <w:rPr>
-          <w:rFonts w:ascii="Noto Serif SC" w:eastAsia="Noto Serif SC" w:hAnsi="Noto Serif SC" w:cs="Noto Serif"/>
-          <w:sz w:val="24"/>
-          <w:szCs w:val="24"/>
-          <w:lang w:val="en-US"/>
-        </w:rPr>
-        <w:t xml:space="preserve"> </w:t>
-      </w:r>
-      <w:r>
-        <w:rPr>
-          <w:rFonts w:ascii="Noto Serif SC" w:eastAsia="Noto Serif SC" w:hAnsi="Noto Serif SC" w:cs="Noto Serif"/>
-          <w:sz w:val="24"/>
-          <w:szCs w:val="24"/>
-          <w:lang w:val="en-US"/>
-        </w:rPr>
-        <w:t xml:space="preserve">4 </w:t>
-      </w:r>
-      <w:r>
-        <w:rPr>
-          <w:rFonts w:ascii="Noto Serif SC" w:eastAsia="Noto Serif SC" w:hAnsi="Noto Serif SC" w:cs="Noto Serif"/>
-          <w:sz w:val="24"/>
-          <w:szCs w:val="24"/>
-          <w:lang w:val="en-US"/>
-        </w:rPr>
-        <w:t>Pipa</w:t>
-      </w:r>
-    </w:p>
-    <w:p>
-      <w:pPr>
-        <w:rPr>
-          <w:rFonts w:ascii="Noto Serif SC" w:eastAsia="Noto Serif SC" w:hAnsi="Noto Serif SC" w:cs="Noto Serif"/>
-          <w:sz w:val="24"/>
-          <w:szCs w:val="24"/>
-          <w:lang w:val="en-US"/>
-        </w:rPr>
-      </w:pPr>
-      <w:r>
-        <w:rPr>
-          <w:rFonts w:ascii="Noto Serif SC" w:eastAsia="Noto Serif SC" w:hAnsi="Noto Serif SC" w:cs="Noto Serif"/>
-          <w:sz w:val="24"/>
-          <w:szCs w:val="24"/>
-          <w:lang w:val="en-GB"/>
-        </w:rPr>
-        <w:t xml:space="preserve">2 </w:t>
-      </w:r>
-      <w:r>
-        <w:rPr>
-          <w:rFonts w:ascii="Noto Serif SC" w:eastAsia="Noto Serif SC" w:hAnsi="Noto Serif SC" w:cs="Noto Serif" w:hint="eastAsia"/>
-          <w:sz w:val="24"/>
-          <w:szCs w:val="24"/>
-          <w:lang w:val="en-GB"/>
-        </w:rPr>
-        <w:t>高音阮</w:t>
-      </w:r>
-      <w:r>
-        <w:rPr>
-          <w:rFonts w:ascii="Noto Serif SC" w:eastAsia="Noto Serif SC" w:hAnsi="Noto Serif SC" w:cs="Noto Serif"/>
-          <w:sz w:val="24"/>
-          <w:szCs w:val="24"/>
-          <w:lang w:val="en-GB"/>
-        </w:rPr>
-        <w:t xml:space="preserve"> </w:t>
-      </w:r>
-      <w:r>
-        <w:rPr>
-          <w:rFonts w:ascii="Noto Serif SC" w:eastAsia="Noto Serif SC" w:hAnsi="Noto Serif SC" w:cs="Noto Serif"/>
-          <w:sz w:val="24"/>
-          <w:szCs w:val="24"/>
-          <w:lang w:val="en-GB"/>
-        </w:rPr>
-        <w:t xml:space="preserve">2 </w:t>
-      </w:r>
-      <w:proofErr w:type="spellStart"/>
-      <w:r>
-        <w:rPr>
-          <w:rFonts w:ascii="Noto Serif SC" w:eastAsia="Noto Serif SC" w:hAnsi="Noto Serif SC" w:cs="Noto Serif"/>
-          <w:sz w:val="24"/>
-          <w:szCs w:val="24"/>
-          <w:lang w:val="en-GB"/>
-        </w:rPr>
-        <w:t>Gaoyin</w:t>
-      </w:r>
-      <w:proofErr w:type="spellEnd"/>
-      <w:r>
-        <w:rPr>
-          <w:rFonts w:ascii="Noto Serif SC" w:eastAsia="Noto Serif SC" w:hAnsi="Noto Serif SC" w:cs="Noto Serif"/>
-          <w:sz w:val="24"/>
-          <w:szCs w:val="24"/>
-          <w:lang w:val="en-GB"/>
-        </w:rPr>
-        <w:t xml:space="preserve"> Ruan</w:t>
-      </w:r>
-    </w:p>
-    <w:p>
-      <w:pPr>
-        <w:rPr>
-          <w:rFonts w:ascii="Noto Serif SC" w:eastAsia="Noto Serif SC" w:hAnsi="Noto Serif SC" w:cs="Noto Serif"/>
-          <w:sz w:val="24"/>
-          <w:szCs w:val="24"/>
-          <w:lang w:val="en-US"/>
-        </w:rPr>
-      </w:pPr>
-      <w:r>
-        <w:rPr>
-          <w:rFonts w:ascii="Noto Serif SC" w:eastAsia="Noto Serif SC" w:hAnsi="Noto Serif SC" w:cs="Noto Serif"/>
-          <w:sz w:val="24"/>
-          <w:szCs w:val="24"/>
-          <w:lang w:val="en-US"/>
-        </w:rPr>
-        <w:t xml:space="preserve">4 </w:t>
-      </w:r>
-      <w:r>
-        <w:rPr>
-          <w:rFonts w:ascii="Noto Serif SC" w:eastAsia="Noto Serif SC" w:hAnsi="Noto Serif SC" w:cs="Noto Serif" w:hint="eastAsia"/>
-          <w:sz w:val="24"/>
-          <w:szCs w:val="24"/>
-          <w:lang w:val="en-US"/>
-        </w:rPr>
-        <w:t>中阮</w:t>
-      </w:r>
-      <w:r>
-        <w:rPr>
-          <w:rFonts w:ascii="Noto Serif SC" w:eastAsia="Noto Serif SC" w:hAnsi="Noto Serif SC" w:cs="Noto Serif"/>
-          <w:sz w:val="24"/>
-          <w:szCs w:val="24"/>
-          <w:lang w:val="en-US"/>
-        </w:rPr>
-        <w:t xml:space="preserve"> </w:t>
-      </w:r>
-      <w:r>
-        <w:rPr>
-          <w:rFonts w:ascii="Noto Serif SC" w:eastAsia="Noto Serif SC" w:hAnsi="Noto Serif SC" w:cs="Noto Serif"/>
-          <w:sz w:val="24"/>
-          <w:szCs w:val="24"/>
-          <w:lang w:val="en-US"/>
-        </w:rPr>
-        <w:t>4</w:t>
-      </w:r>
-      <w:r>
-        <w:rPr>
-          <w:rFonts w:ascii="Noto Serif SC" w:eastAsia="Noto Serif SC" w:hAnsi="Noto Serif SC" w:cs="Noto Serif"/>
-          <w:sz w:val="24"/>
-          <w:szCs w:val="24"/>
-          <w:lang w:val="en-US"/>
-        </w:rPr>
-        <w:t xml:space="preserve"> Zhongruan</w:t>
-      </w:r>
-    </w:p>
-    <w:p>
-      <w:pPr>
-        <w:rPr>
-          <w:rFonts w:ascii="Noto Serif SC" w:eastAsia="Noto Serif SC" w:hAnsi="Noto Serif SC" w:cs="Noto Serif"/>
-          <w:sz w:val="24"/>
-          <w:szCs w:val="24"/>
-          <w:lang w:val="en-US"/>
-        </w:rPr>
-      </w:pPr>
-      <w:r>
-        <w:rPr>
-          <w:rFonts w:ascii="Noto Serif SC" w:eastAsia="Noto Serif SC" w:hAnsi="Noto Serif SC" w:cs="Noto Serif"/>
-          <w:sz w:val="24"/>
-          <w:szCs w:val="24"/>
-          <w:lang w:val="en-US"/>
-        </w:rPr>
-        <w:t xml:space="preserve">2 </w:t>
-      </w:r>
-      <w:r>
-        <w:rPr>
-          <w:rFonts w:ascii="Noto Serif SC" w:eastAsia="Noto Serif SC" w:hAnsi="Noto Serif SC" w:cs="Noto Serif" w:hint="eastAsia"/>
-          <w:sz w:val="24"/>
-          <w:szCs w:val="24"/>
-          <w:lang w:val="en-US"/>
-        </w:rPr>
-        <w:t>大阮</w:t>
-      </w:r>
-      <w:r>
-        <w:rPr>
-          <w:rFonts w:ascii="Noto Serif SC" w:eastAsia="Noto Serif SC" w:hAnsi="Noto Serif SC" w:cs="Noto Serif"/>
-          <w:sz w:val="24"/>
-          <w:szCs w:val="24"/>
-          <w:lang w:val="en-US"/>
-        </w:rPr>
-        <w:t xml:space="preserve"> </w:t>
-      </w:r>
-      <w:r>
-        <w:rPr>
-          <w:rFonts w:ascii="Noto Serif SC" w:eastAsia="Noto Serif SC" w:hAnsi="Noto Serif SC" w:cs="Noto Serif"/>
-          <w:sz w:val="24"/>
-          <w:szCs w:val="24"/>
-          <w:lang w:val="en-US"/>
-        </w:rPr>
-        <w:t xml:space="preserve">2 </w:t>
-      </w:r>
-      <w:r>
-        <w:rPr>
-          <w:rFonts w:ascii="Noto Serif SC" w:eastAsia="Noto Serif SC" w:hAnsi="Noto Serif SC" w:cs="Noto Serif"/>
-          <w:sz w:val="24"/>
-          <w:szCs w:val="24"/>
-          <w:lang w:val="en-US"/>
-        </w:rPr>
-        <w:t>Daruan</w:t>
-      </w:r>
-    </w:p>
-    <w:p>
-      <w:pPr>
-        <w:rPr>
-          <w:rFonts w:ascii="Noto Serif SC" w:eastAsia="Noto Serif SC" w:hAnsi="Noto Serif SC" w:cs="Noto Serif"/>
-          <w:sz w:val="24"/>
-          <w:szCs w:val="24"/>
-          <w:lang w:val="en-US"/>
-        </w:rPr>
-      </w:pPr>
-      <w:r>
-        <w:rPr>
-          <w:rFonts w:ascii="Noto Serif SC" w:eastAsia="Noto Serif SC" w:hAnsi="Noto Serif SC" w:cs="Noto Serif"/>
-          <w:sz w:val="24"/>
-          <w:szCs w:val="24"/>
-          <w:lang w:val="en-US"/>
-        </w:rPr>
-        <w:t xml:space="preserve">1 </w:t>
-      </w:r>
-      <w:r>
-        <w:rPr>
-          <w:rFonts w:ascii="Noto Serif SC" w:eastAsia="Noto Serif SC" w:hAnsi="Noto Serif SC" w:cs="Noto Serif" w:hint="eastAsia"/>
-          <w:sz w:val="24"/>
-          <w:szCs w:val="24"/>
-          <w:lang w:val="en-US"/>
-        </w:rPr>
-        <w:t>古筝</w:t>
-      </w:r>
-      <w:r>
-        <w:rPr>
-          <w:rFonts w:ascii="Noto Serif SC" w:eastAsia="Noto Serif SC" w:hAnsi="Noto Serif SC" w:cs="Noto Serif"/>
-          <w:sz w:val="24"/>
-          <w:szCs w:val="24"/>
-          <w:lang w:val="en-US"/>
-        </w:rPr>
-        <w:t xml:space="preserve"> </w:t>
-      </w:r>
-      <w:r>
-        <w:rPr>
-          <w:rFonts w:ascii="Noto Serif SC" w:eastAsia="Noto Serif SC" w:hAnsi="Noto Serif SC" w:cs="Noto Serif"/>
-          <w:sz w:val="24"/>
-          <w:szCs w:val="24"/>
-          <w:lang w:val="en-US"/>
-        </w:rPr>
-        <w:t xml:space="preserve">1 </w:t>
-      </w:r>
       <w:r>
         <w:rPr>
           <w:rFonts w:ascii="Noto Serif SC" w:eastAsia="Noto Serif SC" w:hAnsi="Noto Serif SC" w:cs="Noto Serif"/>
@@ -4091,25 +3780,7 @@
           <w:sz w:val="21"/>
           <w:szCs w:val="21"/>
         </w:rPr>
-        <w:t xml:space="preserve"> </w:t>
-      </w:r>
-      <w:proofErr w:type="spellStart"/>
-      <w:r>
-        <w:rPr>
-          <w:rFonts w:ascii="Noto Serif SC" w:eastAsia="Noto Serif SC" w:hAnsi="Noto Serif SC" w:cs="Noto Serif"/>
-          <w:sz w:val="21"/>
-          <w:szCs w:val="21"/>
-        </w:rPr>
-        <w:t>Fengluo</w:t>
-      </w:r>
-      <w:proofErr w:type="spellEnd"/>
-      <w:r>
-        <w:rPr>
-          <w:rFonts w:ascii="Noto Serif SC" w:eastAsia="Noto Serif SC" w:hAnsi="Noto Serif SC" w:cs="Noto Serif"/>
-          <w:sz w:val="21"/>
-          <w:szCs w:val="21"/>
-        </w:rPr>
-        <w:t xml:space="preserve">, </w:t>
+        <w:t xml:space="preserve"> Fengluo, </w:t>
       </w:r>
       <w:r>
         <w:rPr>
@@ -4228,16 +3899,7 @@
           <w:sz w:val="21"/>
           <w:szCs w:val="21"/>
         </w:rPr>
-        <w:t xml:space="preserve"> </w:t>
-      </w:r>
-      <w:proofErr w:type="spellStart"/>
-      <w:r>
-        <w:rPr>
-          <w:rFonts w:ascii="Noto Serif SC" w:eastAsia="Noto Serif SC" w:hAnsi="Noto Serif SC" w:cs="Noto Serif"/>
-          <w:sz w:val="21"/>
-          <w:szCs w:val="21"/>
-        </w:rPr>
-        <w:t>D</w:t>
+        <w:t xml:space="preserve"> D</w:t>
       </w:r>
       <w:r>
         <w:rPr>
@@ -4253,16 +3915,7 @@
           <w:sz w:val="21"/>
           <w:szCs w:val="21"/>
         </w:rPr>
-        <w:t>anggu</w:t>
-      </w:r>
-      <w:proofErr w:type="spellEnd"/>
-      <w:r>
-        <w:rPr>
-          <w:rFonts w:ascii="Noto Serif SC" w:eastAsia="Noto Serif SC" w:hAnsi="Noto Serif SC" w:cs="Noto Serif"/>
-          <w:sz w:val="21"/>
-          <w:szCs w:val="21"/>
-        </w:rPr>
-        <w:t xml:space="preserve">, </w:t>
+        <w:t xml:space="preserve">anggu, </w:t>
       </w:r>
       <w:r>
         <w:rPr>
@@ -4286,7 +3939,23 @@
           <w:sz w:val="21"/>
           <w:szCs w:val="21"/>
         </w:rPr>
-        <w:t>小风铃</w:t>
+        <w:t>小</w:t>
+      </w:r>
+      <w:r>
+        <w:rPr>
+          <w:rFonts w:ascii="Noto Serif SC" w:eastAsia="Noto Serif SC" w:hAnsi="Noto Serif SC" w:cs="Noto Serif" w:hint="eastAsia"/>
+          <w:sz w:val="21"/>
+          <w:szCs w:val="21"/>
+        </w:rPr>
+        <w:t>/大</w:t>
+      </w:r>
+      <w:r>
+        <w:rPr>
+          <w:rFonts w:ascii="Noto Serif SC" w:eastAsia="Noto Serif SC" w:hAnsi="Noto Serif SC" w:cs="Noto Serif" w:hint="eastAsia"/>
+          <w:sz w:val="21"/>
+          <w:szCs w:val="21"/>
+        </w:rPr>
+        <w:t>风铃</w:t>
       </w:r>
       <w:r>
         <w:rPr>
@@ -4372,99 +4041,252 @@
           <w:sz w:val="21"/>
           <w:szCs w:val="21"/>
         </w:rPr>
+        <w:t xml:space="preserve"> Da</w:t>
+      </w:r>
+      <w:r>
+        <w:rPr>
+          <w:rFonts w:ascii="Noto Serif SC" w:eastAsia="Noto Serif SC" w:hAnsi="Noto Serif SC" w:cs="Noto Serif"/>
+          <w:sz w:val="21"/>
+          <w:szCs w:val="21"/>
+        </w:rPr>
+        <w:t>t</w:t>
+      </w:r>
+      <w:r>
+        <w:rPr>
+          <w:rFonts w:ascii="Noto Serif SC" w:eastAsia="Noto Serif SC" w:hAnsi="Noto Serif SC" w:cs="Noto Serif"/>
+          <w:sz w:val="21"/>
+          <w:szCs w:val="21"/>
+        </w:rPr>
+        <w:t xml:space="preserve">anggu, </w:t>
+      </w:r>
+      <w:r>
+        <w:rPr>
+          <w:rFonts w:ascii="Noto Serif SC" w:eastAsia="Noto Serif SC" w:hAnsi="Noto Serif SC" w:cs="Noto Serif" w:hint="eastAsia"/>
+          <w:sz w:val="21"/>
+          <w:szCs w:val="21"/>
+        </w:rPr>
+        <w:t>小堂鼓</w:t>
+      </w:r>
+      <w:r>
+        <w:rPr>
+          <w:rFonts w:ascii="Noto Serif SC" w:eastAsia="Noto Serif SC" w:hAnsi="Noto Serif SC" w:cs="Noto Serif"/>
+          <w:sz w:val="21"/>
+          <w:szCs w:val="21"/>
+        </w:rPr>
+        <w:t xml:space="preserve"> Xiao</w:t>
+      </w:r>
+      <w:r>
+        <w:rPr>
+          <w:rFonts w:ascii="Noto Serif SC" w:eastAsia="Noto Serif SC" w:hAnsi="Noto Serif SC" w:cs="Noto Serif"/>
+          <w:sz w:val="21"/>
+          <w:szCs w:val="21"/>
+        </w:rPr>
+        <w:t>t</w:t>
+      </w:r>
+      <w:r>
+        <w:rPr>
+          <w:rFonts w:ascii="Noto Serif SC" w:eastAsia="Noto Serif SC" w:hAnsi="Noto Serif SC" w:cs="Noto Serif"/>
+          <w:sz w:val="21"/>
+          <w:szCs w:val="21"/>
+        </w:rPr>
+        <w:t>anggu</w:t>
+      </w:r>
+      <w:r>
+        <w:rPr>
+          <w:rFonts w:ascii="Noto Serif SC" w:eastAsia="Noto Serif SC" w:hAnsi="Noto Serif SC" w:cs="Noto Serif"/>
+          <w:sz w:val="21"/>
+          <w:szCs w:val="21"/>
+        </w:rPr>
+        <w:t xml:space="preserve">, </w:t>
+      </w:r>
+      <w:r>
+        <w:rPr>
+          <w:rFonts w:ascii="Noto Serif SC" w:eastAsia="Noto Serif SC" w:hAnsi="Noto Serif SC" w:cs="Noto Serif" w:hint="eastAsia"/>
+          <w:sz w:val="21"/>
+          <w:szCs w:val="21"/>
+        </w:rPr>
+        <w:t>小</w:t>
+      </w:r>
+      <w:r>
+        <w:rPr>
+          <w:rFonts w:ascii="Noto Serif SC" w:eastAsia="Noto Serif SC" w:hAnsi="Noto Serif SC" w:cs="Noto Serif" w:hint="eastAsia"/>
+          <w:sz w:val="21"/>
+          <w:szCs w:val="21"/>
+        </w:rPr>
+        <w:t>/大</w:t>
+      </w:r>
+      <w:r>
+        <w:rPr>
+          <w:rFonts w:ascii="Noto Serif SC" w:eastAsia="Noto Serif SC" w:hAnsi="Noto Serif SC" w:cs="Noto Serif"/>
+          <w:sz w:val="21"/>
+          <w:szCs w:val="21"/>
+        </w:rPr>
+        <w:t xml:space="preserve">玻铃 </w:t>
+      </w:r>
+      <w:r>
+        <w:rPr>
+          <w:rFonts w:ascii="Noto Serif SC" w:eastAsia="Noto Serif SC" w:hAnsi="Noto Serif SC" w:cs="Noto Serif"/>
+          <w:sz w:val="21"/>
+          <w:szCs w:val="21"/>
+        </w:rPr>
+        <w:t xml:space="preserve">Small </w:t>
+      </w:r>
+      <w:r>
+        <w:rPr>
+          <w:rFonts w:ascii="Noto Serif SC" w:eastAsia="Noto Serif SC" w:hAnsi="Noto Serif SC" w:cs="Noto Serif"/>
+          <w:sz w:val="21"/>
+          <w:szCs w:val="21"/>
+        </w:rPr>
+        <w:t>Glasschimes</w:t>
+      </w:r>
+      <w:r>
+        <w:rPr>
+          <w:rFonts w:ascii="Noto Serif SC" w:eastAsia="Noto Serif SC" w:hAnsi="Noto Serif SC" w:cs="Noto Serif"/>
+          <w:sz w:val="21"/>
+          <w:szCs w:val="21"/>
+        </w:rPr>
         <w:t xml:space="preserve"> </w:t>
       </w:r>
-      <w:proofErr w:type="spellStart"/>
-      <w:r>
-        <w:rPr>
-          <w:rFonts w:ascii="Noto Serif SC" w:eastAsia="Noto Serif SC" w:hAnsi="Noto Serif SC" w:cs="Noto Serif"/>
-          <w:sz w:val="21"/>
-          <w:szCs w:val="21"/>
-        </w:rPr>
-        <w:t>Da</w:t>
-      </w:r>
-      <w:r>
-        <w:rPr>
-          <w:rFonts w:ascii="Noto Serif SC" w:eastAsia="Noto Serif SC" w:hAnsi="Noto Serif SC" w:cs="Noto Serif"/>
-          <w:sz w:val="21"/>
-          <w:szCs w:val="21"/>
-        </w:rPr>
-        <w:t>t</w:t>
-      </w:r>
-      <w:r>
-        <w:rPr>
-          <w:rFonts w:ascii="Noto Serif SC" w:eastAsia="Noto Serif SC" w:hAnsi="Noto Serif SC" w:cs="Noto Serif"/>
-          <w:sz w:val="21"/>
-          <w:szCs w:val="21"/>
-        </w:rPr>
-        <w:t>anggu</w:t>
-      </w:r>
-      <w:proofErr w:type="spellEnd"/>
-      <w:r>
-        <w:rPr>
-          <w:rFonts w:ascii="Noto Serif SC" w:eastAsia="Noto Serif SC" w:hAnsi="Noto Serif SC" w:cs="Noto Serif"/>
-          <w:sz w:val="21"/>
-          <w:szCs w:val="21"/>
-        </w:rPr>
-        <w:t xml:space="preserve">, </w:t>
-      </w:r>
-      <w:r>
-        <w:rPr>
-          <w:rFonts w:ascii="Noto Serif SC" w:eastAsia="Noto Serif SC" w:hAnsi="Noto Serif SC" w:cs="Noto Serif" w:hint="eastAsia"/>
-          <w:sz w:val="21"/>
-          <w:szCs w:val="21"/>
-        </w:rPr>
-        <w:t>小堂鼓</w:t>
-      </w:r>
-      <w:r>
-        <w:rPr>
-          <w:rFonts w:ascii="Noto Serif SC" w:eastAsia="Noto Serif SC" w:hAnsi="Noto Serif SC" w:cs="Noto Serif"/>
-          <w:sz w:val="21"/>
-          <w:szCs w:val="21"/>
+    </w:p>
+    <w:p>
+      <w:pPr>
+        <w:ind w:left="720" w:hanging="436"/>
+        <w:rPr>
+          <w:rFonts w:ascii="Noto Serif SC" w:eastAsia="Noto Serif SC" w:hAnsi="Noto Serif SC" w:cs="Noto Serif"/>
+          <w:sz w:val="21"/>
+          <w:szCs w:val="21"/>
+          <w:lang w:val="en-GB"/>
+        </w:rPr>
+      </w:pPr>
+      <w:r>
+        <w:rPr>
+          <w:rFonts w:ascii="Noto Serif SC" w:eastAsia="Noto Serif SC" w:hAnsi="Noto Serif SC" w:cs="Noto Serif"/>
+          <w:sz w:val="21"/>
+          <w:szCs w:val="21"/>
+          <w:lang w:val="en-US"/>
+        </w:rPr>
+        <w:t xml:space="preserve">V: </w:t>
+      </w:r>
+      <w:r>
+        <w:rPr>
+          <w:rFonts w:ascii="Noto Serif SC" w:eastAsia="Noto Serif SC" w:hAnsi="Noto Serif SC" w:cs="Noto Serif" w:hint="eastAsia"/>
+          <w:sz w:val="21"/>
+          <w:szCs w:val="21"/>
+        </w:rPr>
+        <w:t>板鼓</w:t>
+      </w:r>
+      <w:r>
+        <w:rPr>
+          <w:rFonts w:ascii="Noto Serif SC" w:eastAsia="Noto Serif SC" w:hAnsi="Noto Serif SC" w:cs="Noto Serif"/>
+          <w:sz w:val="21"/>
+          <w:szCs w:val="21"/>
+        </w:rPr>
+        <w:t xml:space="preserve"> Bangu, </w:t>
+      </w:r>
+      <w:r>
+        <w:rPr>
+          <w:rFonts w:ascii="Noto Serif SC" w:eastAsia="Noto Serif SC" w:hAnsi="Noto Serif SC" w:cs="Noto Serif" w:hint="eastAsia"/>
+          <w:sz w:val="21"/>
+          <w:szCs w:val="21"/>
+        </w:rPr>
+        <w:t>弹簧鼓</w:t>
+      </w:r>
+      <w:r>
+        <w:rPr>
+          <w:rFonts w:ascii="Noto Serif SC" w:eastAsia="Noto Serif SC" w:hAnsi="Noto Serif SC" w:cs="Noto Serif"/>
+          <w:sz w:val="21"/>
+          <w:szCs w:val="21"/>
+          <w:lang w:val="en-GB"/>
         </w:rPr>
         <w:t xml:space="preserve"> </w:t>
       </w:r>
-      <w:proofErr w:type="spellStart"/>
-      <w:r>
-        <w:rPr>
-          <w:rFonts w:ascii="Noto Serif SC" w:eastAsia="Noto Serif SC" w:hAnsi="Noto Serif SC" w:cs="Noto Serif"/>
-          <w:sz w:val="21"/>
-          <w:szCs w:val="21"/>
-        </w:rPr>
-        <w:t>Xiao</w:t>
-      </w:r>
-      <w:r>
-        <w:rPr>
-          <w:rFonts w:ascii="Noto Serif SC" w:eastAsia="Noto Serif SC" w:hAnsi="Noto Serif SC" w:cs="Noto Serif"/>
-          <w:sz w:val="21"/>
-          <w:szCs w:val="21"/>
-        </w:rPr>
-        <w:t>t</w:t>
-      </w:r>
-      <w:r>
-        <w:rPr>
-          <w:rFonts w:ascii="Noto Serif SC" w:eastAsia="Noto Serif SC" w:hAnsi="Noto Serif SC" w:cs="Noto Serif"/>
-          <w:sz w:val="21"/>
-          <w:szCs w:val="21"/>
-        </w:rPr>
-        <w:t>anggu</w:t>
-      </w:r>
-      <w:proofErr w:type="spellEnd"/>
-      <w:r>
-        <w:rPr>
-          <w:rFonts w:ascii="Noto Serif SC" w:eastAsia="Noto Serif SC" w:hAnsi="Noto Serif SC" w:cs="Noto Serif"/>
-          <w:sz w:val="21"/>
-          <w:szCs w:val="21"/>
-        </w:rPr>
-        <w:t xml:space="preserve">, </w:t>
-      </w:r>
-      <w:r>
-        <w:rPr>
-          <w:rFonts w:ascii="Noto Serif SC" w:eastAsia="Noto Serif SC" w:hAnsi="Noto Serif SC" w:cs="Noto Serif"/>
-          <w:sz w:val="21"/>
-          <w:szCs w:val="21"/>
-        </w:rPr>
-        <w:t xml:space="preserve">小玻铃 </w:t>
+      <w:r>
+        <w:rPr>
+          <w:rFonts w:ascii="Noto Serif SC" w:eastAsia="Noto Serif SC" w:hAnsi="Noto Serif SC" w:cs="Noto Serif"/>
+          <w:sz w:val="21"/>
+          <w:szCs w:val="21"/>
+        </w:rPr>
+        <w:t xml:space="preserve">Thunder tube, </w:t>
+      </w:r>
+      <w:r>
+        <w:rPr>
+          <w:rFonts w:ascii="Noto Serif SC" w:eastAsia="Noto Serif SC" w:hAnsi="Noto Serif SC" w:cs="Noto Serif" w:hint="eastAsia"/>
+          <w:sz w:val="21"/>
+          <w:szCs w:val="21"/>
+        </w:rPr>
+        <w:t>拍板</w:t>
+      </w:r>
+      <w:r>
+        <w:rPr>
+          <w:rFonts w:ascii="Noto Serif SC" w:eastAsia="Noto Serif SC" w:hAnsi="Noto Serif SC" w:cs="Noto Serif"/>
+          <w:sz w:val="21"/>
+          <w:szCs w:val="21"/>
+        </w:rPr>
+        <w:t xml:space="preserve"> Paiban, </w:t>
+      </w:r>
+      <w:r>
+        <w:rPr>
+          <w:rFonts w:ascii="Noto Serif SC" w:eastAsia="Noto Serif SC" w:hAnsi="Noto Serif SC" w:cs="Noto Serif" w:hint="eastAsia"/>
+          <w:sz w:val="21"/>
+          <w:szCs w:val="21"/>
+        </w:rPr>
+        <w:t>狮钹</w:t>
+      </w:r>
+      <w:r>
+        <w:rPr>
+          <w:rFonts w:ascii="Noto Serif SC" w:eastAsia="Noto Serif SC" w:hAnsi="Noto Serif SC" w:cs="Noto Serif"/>
+          <w:sz w:val="21"/>
+          <w:szCs w:val="21"/>
+        </w:rPr>
+        <w:t xml:space="preserve"> Shibo, </w:t>
+      </w:r>
+      <w:r>
+        <w:rPr>
+          <w:rFonts w:ascii="Noto Serif SC" w:eastAsia="Noto Serif SC" w:hAnsi="Noto Serif SC" w:cs="Noto Serif" w:hint="eastAsia"/>
+          <w:sz w:val="21"/>
+          <w:szCs w:val="21"/>
+        </w:rPr>
+        <w:t>低音木鱼</w:t>
+      </w:r>
+      <w:r>
+        <w:rPr>
+          <w:rFonts w:ascii="Noto Serif SC" w:eastAsia="Noto Serif SC" w:hAnsi="Noto Serif SC" w:cs="Noto Serif"/>
+          <w:sz w:val="21"/>
+          <w:szCs w:val="21"/>
+        </w:rPr>
+        <w:t xml:space="preserve"> Low Wooden Fish, </w:t>
+      </w:r>
+      <w:r>
+        <w:rPr>
+          <w:rFonts w:ascii="Noto Serif SC" w:eastAsia="Noto Serif SC" w:hAnsi="Noto Serif SC" w:cs="Noto Serif" w:hint="eastAsia"/>
+          <w:sz w:val="21"/>
+          <w:szCs w:val="21"/>
+        </w:rPr>
+        <w:t>小</w:t>
+      </w:r>
+      <w:r>
+        <w:rPr>
+          <w:rFonts w:ascii="Noto Serif SC" w:eastAsia="Noto Serif SC" w:hAnsi="Noto Serif SC" w:cs="Noto Serif" w:hint="eastAsia"/>
+          <w:sz w:val="21"/>
+          <w:szCs w:val="21"/>
+        </w:rPr>
+        <w:t>/大</w:t>
+      </w:r>
+      <w:r>
+        <w:rPr>
+          <w:rFonts w:ascii="Noto Serif SC" w:eastAsia="Noto Serif SC" w:hAnsi="Noto Serif SC" w:cs="Noto Serif" w:hint="eastAsia"/>
+          <w:sz w:val="21"/>
+          <w:szCs w:val="21"/>
+        </w:rPr>
+        <w:t>木铃</w:t>
+      </w:r>
+      <w:r>
+        <w:rPr>
+          <w:rFonts w:ascii="Noto Serif SC" w:eastAsia="Noto Serif SC" w:hAnsi="Noto Serif SC" w:cs="Noto Serif"/>
+          <w:sz w:val="21"/>
+          <w:szCs w:val="21"/>
+        </w:rPr>
+        <w:t xml:space="preserve"> </w:t>
       </w:r>
       <w:r>
         <w:rPr>
@@ -4474,600 +4296,293 @@
         </w:rPr>
         <w:t xml:space="preserve">Small </w:t>
       </w:r>
-      <w:proofErr w:type="spellStart"/>
-      <w:r>
-        <w:rPr>
-          <w:rFonts w:ascii="Noto Serif SC" w:eastAsia="Noto Serif SC" w:hAnsi="Noto Serif SC" w:cs="Noto Serif"/>
-          <w:sz w:val="21"/>
-          <w:szCs w:val="21"/>
-        </w:rPr>
-        <w:t>Glasschimes</w:t>
-      </w:r>
-      <w:proofErr w:type="spellEnd"/>
-      <w:r>
-        <w:rPr>
-          <w:rFonts w:ascii="Noto Serif SC" w:eastAsia="Noto Serif SC" w:hAnsi="Noto Serif SC" w:cs="Noto Serif"/>
-          <w:sz w:val="21"/>
-          <w:szCs w:val="21"/>
+      <w:r>
+        <w:rPr>
+          <w:rFonts w:ascii="Noto Serif SC" w:eastAsia="Noto Serif SC" w:hAnsi="Noto Serif SC" w:cs="Noto Serif"/>
+          <w:sz w:val="21"/>
+          <w:szCs w:val="21"/>
+        </w:rPr>
+        <w:t>Wood</w:t>
+      </w:r>
+      <w:r>
+        <w:rPr>
+          <w:rFonts w:ascii="Noto Serif SC" w:eastAsia="Noto Serif SC" w:hAnsi="Noto Serif SC" w:cs="Noto Serif"/>
+          <w:sz w:val="21"/>
+          <w:szCs w:val="21"/>
+        </w:rPr>
+        <w:t>c</w:t>
+      </w:r>
+      <w:r>
+        <w:rPr>
+          <w:rFonts w:ascii="Noto Serif SC" w:eastAsia="Noto Serif SC" w:hAnsi="Noto Serif SC" w:cs="Noto Serif"/>
+          <w:sz w:val="21"/>
+          <w:szCs w:val="21"/>
+        </w:rPr>
+        <w:t>himes</w:t>
+      </w:r>
+    </w:p>
+    <w:p>
+      <w:pPr>
+        <w:ind w:left="720" w:hanging="436"/>
+        <w:rPr>
+          <w:rFonts w:ascii="Noto Serif SC" w:eastAsia="Noto Serif SC" w:hAnsi="Noto Serif SC" w:cs="Noto Serif"/>
+          <w:sz w:val="21"/>
+          <w:szCs w:val="21"/>
+          <w:lang w:val="en-US"/>
+        </w:rPr>
+      </w:pPr>
+      <w:r>
+        <w:rPr>
+          <w:rFonts w:ascii="Noto Serif SC" w:eastAsia="Noto Serif SC" w:hAnsi="Noto Serif SC" w:cs="Noto Serif"/>
+          <w:sz w:val="21"/>
+          <w:szCs w:val="21"/>
+          <w:lang w:val="en-US"/>
+        </w:rPr>
+        <w:t xml:space="preserve">VI: </w:t>
+      </w:r>
+      <w:r>
+        <w:rPr>
+          <w:rFonts w:ascii="Noto Serif SC" w:eastAsia="Noto Serif SC" w:hAnsi="Noto Serif SC" w:cs="Noto Serif" w:hint="eastAsia"/>
+          <w:sz w:val="21"/>
+          <w:szCs w:val="21"/>
+        </w:rPr>
+        <w:t>低音军鼓</w:t>
+      </w:r>
+      <w:r>
+        <w:rPr>
+          <w:rFonts w:ascii="Noto Serif SC" w:eastAsia="Noto Serif SC" w:hAnsi="Noto Serif SC" w:cs="Noto Serif"/>
+          <w:sz w:val="21"/>
+          <w:szCs w:val="21"/>
+        </w:rPr>
+        <w:t xml:space="preserve"> Diyin Jungu, </w:t>
+      </w:r>
+      <w:r>
+        <w:rPr>
+          <w:rFonts w:ascii="Noto Serif SC" w:eastAsia="Noto Serif SC" w:hAnsi="Noto Serif SC" w:cs="Noto Serif" w:hint="eastAsia"/>
+          <w:sz w:val="21"/>
+          <w:szCs w:val="21"/>
+        </w:rPr>
+        <w:t>狮钹</w:t>
+      </w:r>
+      <w:r>
+        <w:rPr>
+          <w:rFonts w:ascii="Noto Serif SC" w:eastAsia="Noto Serif SC" w:hAnsi="Noto Serif SC" w:cs="Noto Serif"/>
+          <w:sz w:val="21"/>
+          <w:szCs w:val="21"/>
+        </w:rPr>
+        <w:t xml:space="preserve"> Shibo, </w:t>
+      </w:r>
+      <w:r>
+        <w:rPr>
+          <w:rFonts w:ascii="Noto Serif SC" w:eastAsia="Noto Serif SC" w:hAnsi="Noto Serif SC" w:cs="Noto Serif" w:hint="eastAsia"/>
+          <w:sz w:val="21"/>
+          <w:szCs w:val="21"/>
+        </w:rPr>
+        <w:t>高音木鱼</w:t>
+      </w:r>
+      <w:r>
+        <w:rPr>
+          <w:rFonts w:ascii="Noto Serif SC" w:eastAsia="Noto Serif SC" w:hAnsi="Noto Serif SC" w:cs="Noto Serif"/>
+          <w:sz w:val="21"/>
+          <w:szCs w:val="21"/>
+        </w:rPr>
+        <w:t xml:space="preserve"> High Wooden Fish, </w:t>
+      </w:r>
+      <w:r>
+        <w:rPr>
+          <w:rFonts w:ascii="Noto Serif SC" w:eastAsia="Noto Serif SC" w:hAnsi="Noto Serif SC" w:cs="Noto Serif" w:hint="eastAsia"/>
+          <w:sz w:val="21"/>
+          <w:szCs w:val="21"/>
+        </w:rPr>
+        <w:t>狮钹</w:t>
+      </w:r>
+      <w:r>
+        <w:rPr>
+          <w:rFonts w:ascii="Noto Serif SC" w:eastAsia="Noto Serif SC" w:hAnsi="Noto Serif SC" w:cs="Noto Serif"/>
+          <w:sz w:val="21"/>
+          <w:szCs w:val="21"/>
+        </w:rPr>
+        <w:t xml:space="preserve"> Shibo, </w:t>
+      </w:r>
+      <w:r>
+        <w:rPr>
+          <w:rFonts w:ascii="Noto Serif SC" w:eastAsia="Noto Serif SC" w:hAnsi="Noto Serif SC" w:cs="Noto Serif" w:hint="eastAsia"/>
+          <w:sz w:val="21"/>
+          <w:szCs w:val="21"/>
+        </w:rPr>
+        <w:t>军钹</w:t>
+      </w:r>
+      <w:r>
+        <w:rPr>
+          <w:rFonts w:ascii="Noto Serif SC" w:eastAsia="Noto Serif SC" w:hAnsi="Noto Serif SC" w:cs="Noto Serif"/>
+          <w:sz w:val="21"/>
+          <w:szCs w:val="21"/>
+        </w:rPr>
+        <w:t xml:space="preserve"> Junbo</w:t>
+      </w:r>
+    </w:p>
+    <w:p>
+      <w:pPr>
+        <w:ind w:left="720" w:hanging="436"/>
+        <w:rPr>
+          <w:rFonts w:ascii="Noto Serif SC" w:eastAsia="Noto Serif SC" w:hAnsi="Noto Serif SC" w:cs="Noto Serif"/>
+          <w:sz w:val="21"/>
+          <w:szCs w:val="21"/>
+          <w:lang w:val="en-US"/>
+        </w:rPr>
+      </w:pPr>
+      <w:r>
+        <w:rPr>
+          <w:rFonts w:ascii="Noto Serif SC" w:eastAsia="Noto Serif SC" w:hAnsi="Noto Serif SC" w:cs="Noto Serif"/>
+          <w:sz w:val="21"/>
+          <w:szCs w:val="21"/>
+          <w:lang w:val="en-US"/>
+        </w:rPr>
+        <w:t xml:space="preserve">VII: </w:t>
+      </w:r>
+      <w:r>
+        <w:rPr>
+          <w:rFonts w:ascii="Noto Serif SC" w:eastAsia="Noto Serif SC" w:hAnsi="Noto Serif SC" w:cs="Noto Serif" w:hint="eastAsia"/>
+          <w:sz w:val="21"/>
+          <w:szCs w:val="21"/>
+        </w:rPr>
+        <w:t>拍板</w:t>
+      </w:r>
+      <w:r>
+        <w:rPr>
+          <w:rFonts w:ascii="Noto Serif SC" w:eastAsia="Noto Serif SC" w:hAnsi="Noto Serif SC" w:cs="Noto Serif"/>
+          <w:sz w:val="21"/>
+          <w:szCs w:val="21"/>
+          <w:lang w:val="en-GB"/>
         </w:rPr>
         <w:t xml:space="preserve"> </w:t>
       </w:r>
-    </w:p>
-    <w:p>
-      <w:pPr>
-        <w:ind w:left="720" w:hanging="436"/>
-        <w:rPr>
-          <w:rFonts w:ascii="Noto Serif SC" w:eastAsia="Noto Serif SC" w:hAnsi="Noto Serif SC" w:cs="Noto Serif"/>
-          <w:sz w:val="21"/>
-          <w:szCs w:val="21"/>
+      <w:r>
+        <w:rPr>
+          <w:rFonts w:ascii="Noto Serif SC" w:eastAsia="Noto Serif SC" w:hAnsi="Noto Serif SC" w:cs="Noto Serif"/>
+          <w:sz w:val="21"/>
+          <w:szCs w:val="21"/>
+        </w:rPr>
+        <w:t xml:space="preserve">Paiban, </w:t>
+      </w:r>
+      <w:r>
+        <w:rPr>
+          <w:rFonts w:ascii="Noto Serif SC" w:eastAsia="Noto Serif SC" w:hAnsi="Noto Serif SC" w:cs="Noto Serif" w:hint="eastAsia"/>
+          <w:sz w:val="21"/>
+          <w:szCs w:val="21"/>
+        </w:rPr>
+        <w:t>狮吼鼓</w:t>
+      </w:r>
+      <w:r>
+        <w:rPr>
+          <w:rFonts w:ascii="Noto Serif SC" w:eastAsia="Noto Serif SC" w:hAnsi="Noto Serif SC" w:cs="Noto Serif"/>
+          <w:sz w:val="21"/>
+          <w:szCs w:val="21"/>
+        </w:rPr>
+        <w:t xml:space="preserve"> Lion roar, </w:t>
+      </w:r>
+      <w:r>
+        <w:rPr>
+          <w:rFonts w:ascii="Noto Serif SC" w:eastAsia="Noto Serif SC" w:hAnsi="Noto Serif SC" w:cs="Noto Serif" w:hint="eastAsia"/>
+          <w:sz w:val="21"/>
+          <w:szCs w:val="21"/>
+        </w:rPr>
+        <w:t>低音大锣</w:t>
+      </w:r>
+      <w:r>
+        <w:rPr>
+          <w:rFonts w:ascii="Noto Serif SC" w:eastAsia="Noto Serif SC" w:hAnsi="Noto Serif SC" w:cs="Noto Serif"/>
+          <w:sz w:val="21"/>
+          <w:szCs w:val="21"/>
+        </w:rPr>
+        <w:t xml:space="preserve"> Diyin Daluo, </w:t>
+      </w:r>
+      <w:r>
+        <w:rPr>
+          <w:rFonts w:ascii="Noto Serif SC" w:eastAsia="Noto Serif SC" w:hAnsi="Noto Serif SC" w:cs="Noto Serif" w:hint="eastAsia"/>
+          <w:sz w:val="21"/>
+          <w:szCs w:val="21"/>
+        </w:rPr>
+        <w:t>高边锣</w:t>
+      </w:r>
+      <w:r>
+        <w:rPr>
+          <w:rFonts w:ascii="Noto Serif SC" w:eastAsia="Noto Serif SC" w:hAnsi="Noto Serif SC" w:cs="Noto Serif"/>
+          <w:sz w:val="21"/>
+          <w:szCs w:val="21"/>
+        </w:rPr>
+        <w:t xml:space="preserve"> Gao Bianluo, </w:t>
+      </w:r>
+      <w:r>
+        <w:rPr>
+          <w:rFonts w:ascii="Noto Serif SC" w:eastAsia="Noto Serif SC" w:hAnsi="Noto Serif SC" w:cs="Noto Serif" w:hint="eastAsia"/>
+          <w:sz w:val="21"/>
+          <w:szCs w:val="21"/>
+        </w:rPr>
+        <w:t>低音罄</w:t>
+      </w:r>
+      <w:r>
+        <w:rPr>
+          <w:rFonts w:ascii="Noto Serif SC" w:eastAsia="Noto Serif SC" w:hAnsi="Noto Serif SC" w:cs="Noto Serif"/>
+          <w:sz w:val="21"/>
+          <w:szCs w:val="21"/>
+        </w:rPr>
+        <w:t xml:space="preserve"> Diyin Qing</w:t>
+      </w:r>
+      <w:r>
+        <w:rPr>
+          <w:rFonts w:ascii="Noto Serif SC" w:eastAsia="Noto Serif SC" w:hAnsi="Noto Serif SC" w:cs="Noto Serif"/>
+          <w:sz w:val="21"/>
+          <w:szCs w:val="21"/>
+        </w:rPr>
+        <w:t xml:space="preserve"> </w:t>
+      </w:r>
+    </w:p>
+    <w:p>
+      <w:pPr>
+        <w:rPr>
+          <w:rFonts w:ascii="Noto Serif SC" w:eastAsia="Noto Serif SC" w:hAnsi="Noto Serif SC" w:cs="Noto Serif"/>
+          <w:sz w:val="24"/>
+          <w:szCs w:val="24"/>
+          <w:lang w:val="en-US"/>
+        </w:rPr>
+      </w:pPr>
+    </w:p>
+    <w:p>
+      <w:pPr>
+        <w:rPr>
+          <w:rFonts w:ascii="Noto Serif SC" w:eastAsia="Noto Serif SC" w:hAnsi="Noto Serif SC" w:cs="Noto Serif"/>
+          <w:sz w:val="24"/>
+          <w:szCs w:val="24"/>
+          <w:lang w:val="en-US"/>
+        </w:rPr>
+      </w:pPr>
+      <w:r>
+        <w:rPr>
+          <w:rFonts w:ascii="Noto Serif SC" w:eastAsia="Noto Serif SC" w:hAnsi="Noto Serif SC" w:cs="Noto Serif" w:hint="eastAsia"/>
+          <w:sz w:val="24"/>
+          <w:szCs w:val="24"/>
+          <w:lang w:val="en-US"/>
+        </w:rPr>
+        <w:t>笛子独奏</w:t>
+      </w:r>
+      <w:r>
+        <w:rPr>
+          <w:rFonts w:ascii="Noto Serif SC" w:eastAsia="Noto Serif SC" w:hAnsi="Noto Serif SC" w:cs="Noto Serif"/>
+          <w:sz w:val="24"/>
+          <w:szCs w:val="24"/>
+          <w:lang w:val="en-US"/>
+        </w:rPr>
+        <w:t xml:space="preserve"> Dizi Solo</w:t>
+      </w:r>
+    </w:p>
+    <w:p>
+      <w:pPr>
+        <w:rPr>
+          <w:rFonts w:ascii="Noto Serif SC" w:eastAsia="Noto Serif SC" w:hAnsi="Noto Serif SC" w:cs="Noto Serif"/>
+          <w:sz w:val="24"/>
+          <w:szCs w:val="24"/>
           <w:lang w:val="en-GB"/>
-        </w:rPr>
-      </w:pPr>
-      <w:r>
-        <w:rPr>
-          <w:rFonts w:ascii="Noto Serif SC" w:eastAsia="Noto Serif SC" w:hAnsi="Noto Serif SC" w:cs="Noto Serif"/>
-          <w:sz w:val="21"/>
-          <w:szCs w:val="21"/>
-          <w:lang w:val="en-US"/>
-        </w:rPr>
-        <w:t xml:space="preserve">V: </w:t>
-      </w:r>
-      <w:r>
-        <w:rPr>
-          <w:rFonts w:ascii="Noto Serif SC" w:eastAsia="Noto Serif SC" w:hAnsi="Noto Serif SC" w:cs="Noto Serif" w:hint="eastAsia"/>
-          <w:sz w:val="21"/>
-          <w:szCs w:val="21"/>
-        </w:rPr>
-        <w:t>板鼓</w:t>
-      </w:r>
-      <w:r>
-        <w:rPr>
-          <w:rFonts w:ascii="Noto Serif SC" w:eastAsia="Noto Serif SC" w:hAnsi="Noto Serif SC" w:cs="Noto Serif"/>
-          <w:sz w:val="21"/>
-          <w:szCs w:val="21"/>
-        </w:rPr>
-        <w:t xml:space="preserve"> Bangu, </w:t>
-      </w:r>
-      <w:r>
-        <w:rPr>
-          <w:rFonts w:ascii="Noto Serif SC" w:eastAsia="Noto Serif SC" w:hAnsi="Noto Serif SC" w:cs="Noto Serif" w:hint="eastAsia"/>
-          <w:sz w:val="21"/>
-          <w:szCs w:val="21"/>
-        </w:rPr>
-        <w:t>弹簧鼓</w:t>
-      </w:r>
-      <w:r>
-        <w:rPr>
-          <w:rFonts w:ascii="Noto Serif SC" w:eastAsia="Noto Serif SC" w:hAnsi="Noto Serif SC" w:cs="Noto Serif"/>
-          <w:sz w:val="21"/>
-          <w:szCs w:val="21"/>
-          <w:lang w:val="en-GB"/>
-        </w:rPr>
-        <w:t xml:space="preserve"> </w:t>
-      </w:r>
-      <w:r>
-        <w:rPr>
-          <w:rFonts w:ascii="Noto Serif SC" w:eastAsia="Noto Serif SC" w:hAnsi="Noto Serif SC" w:cs="Noto Serif"/>
-          <w:sz w:val="21"/>
-          <w:szCs w:val="21"/>
-        </w:rPr>
-        <w:t xml:space="preserve">Thunder tube, </w:t>
-      </w:r>
-      <w:r>
-        <w:rPr>
-          <w:rFonts w:ascii="Noto Serif SC" w:eastAsia="Noto Serif SC" w:hAnsi="Noto Serif SC" w:cs="Noto Serif" w:hint="eastAsia"/>
-          <w:sz w:val="21"/>
-          <w:szCs w:val="21"/>
-        </w:rPr>
-        <w:t>拍板</w:t>
-      </w:r>
-      <w:r>
-        <w:rPr>
-          <w:rFonts w:ascii="Noto Serif SC" w:eastAsia="Noto Serif SC" w:hAnsi="Noto Serif SC" w:cs="Noto Serif"/>
-          <w:sz w:val="21"/>
-          <w:szCs w:val="21"/>
-        </w:rPr>
-        <w:t xml:space="preserve"> Paiban, </w:t>
-      </w:r>
-      <w:r>
-        <w:rPr>
-          <w:rFonts w:ascii="Noto Serif SC" w:eastAsia="Noto Serif SC" w:hAnsi="Noto Serif SC" w:cs="Noto Serif" w:hint="eastAsia"/>
-          <w:sz w:val="21"/>
-          <w:szCs w:val="21"/>
-        </w:rPr>
-        <w:t>狮钹</w:t>
-      </w:r>
-      <w:r>
-        <w:rPr>
-          <w:rFonts w:ascii="Noto Serif SC" w:eastAsia="Noto Serif SC" w:hAnsi="Noto Serif SC" w:cs="Noto Serif"/>
-          <w:sz w:val="21"/>
-          <w:szCs w:val="21"/>
-        </w:rPr>
-        <w:t xml:space="preserve"> </w:t>
-      </w:r>
-      <w:proofErr w:type="spellStart"/>
-      <w:r>
-        <w:rPr>
-          <w:rFonts w:ascii="Noto Serif SC" w:eastAsia="Noto Serif SC" w:hAnsi="Noto Serif SC" w:cs="Noto Serif"/>
-          <w:sz w:val="21"/>
-          <w:szCs w:val="21"/>
-        </w:rPr>
-        <w:t>Shibo</w:t>
-      </w:r>
-      <w:proofErr w:type="spellEnd"/>
-      <w:r>
-        <w:rPr>
-          <w:rFonts w:ascii="Noto Serif SC" w:eastAsia="Noto Serif SC" w:hAnsi="Noto Serif SC" w:cs="Noto Serif"/>
-          <w:sz w:val="21"/>
-          <w:szCs w:val="21"/>
-        </w:rPr>
-        <w:t xml:space="preserve">, </w:t>
-      </w:r>
-      <w:r>
-        <w:rPr>
-          <w:rFonts w:ascii="Noto Serif SC" w:eastAsia="Noto Serif SC" w:hAnsi="Noto Serif SC" w:cs="Noto Serif" w:hint="eastAsia"/>
-          <w:sz w:val="21"/>
-          <w:szCs w:val="21"/>
-        </w:rPr>
-        <w:t>低音木鱼</w:t>
-      </w:r>
-      <w:r>
-        <w:rPr>
-          <w:rFonts w:ascii="Noto Serif SC" w:eastAsia="Noto Serif SC" w:hAnsi="Noto Serif SC" w:cs="Noto Serif"/>
-          <w:sz w:val="21"/>
-          <w:szCs w:val="21"/>
-        </w:rPr>
-        <w:t xml:space="preserve"> Low Wooden Fish, </w:t>
-      </w:r>
-      <w:r>
-        <w:rPr>
-          <w:rFonts w:ascii="Noto Serif SC" w:eastAsia="Noto Serif SC" w:hAnsi="Noto Serif SC" w:cs="Noto Serif" w:hint="eastAsia"/>
-          <w:sz w:val="21"/>
-          <w:szCs w:val="21"/>
-        </w:rPr>
-        <w:t>小木铃</w:t>
-      </w:r>
-      <w:r>
-        <w:rPr>
-          <w:rFonts w:ascii="Noto Serif SC" w:eastAsia="Noto Serif SC" w:hAnsi="Noto Serif SC" w:cs="Noto Serif"/>
-          <w:sz w:val="21"/>
-          <w:szCs w:val="21"/>
-        </w:rPr>
-        <w:t xml:space="preserve"> </w:t>
-      </w:r>
-      <w:r>
-        <w:rPr>
-          <w:rFonts w:ascii="Noto Serif SC" w:eastAsia="Noto Serif SC" w:hAnsi="Noto Serif SC" w:cs="Noto Serif"/>
-          <w:sz w:val="21"/>
-          <w:szCs w:val="21"/>
-        </w:rPr>
-        <w:t xml:space="preserve">Small </w:t>
-      </w:r>
-      <w:proofErr w:type="spellStart"/>
-      <w:r>
-        <w:rPr>
-          <w:rFonts w:ascii="Noto Serif SC" w:eastAsia="Noto Serif SC" w:hAnsi="Noto Serif SC" w:cs="Noto Serif"/>
-          <w:sz w:val="21"/>
-          <w:szCs w:val="21"/>
-        </w:rPr>
-        <w:t>Wood</w:t>
-      </w:r>
-      <w:r>
-        <w:rPr>
-          <w:rFonts w:ascii="Noto Serif SC" w:eastAsia="Noto Serif SC" w:hAnsi="Noto Serif SC" w:cs="Noto Serif"/>
-          <w:sz w:val="21"/>
-          <w:szCs w:val="21"/>
-        </w:rPr>
-        <w:t>c</w:t>
-      </w:r>
-      <w:r>
-        <w:rPr>
-          <w:rFonts w:ascii="Noto Serif SC" w:eastAsia="Noto Serif SC" w:hAnsi="Noto Serif SC" w:cs="Noto Serif"/>
-          <w:sz w:val="21"/>
-          <w:szCs w:val="21"/>
-        </w:rPr>
-        <w:t>himes</w:t>
-      </w:r>
-      <w:proofErr w:type="spellEnd"/>
-    </w:p>
-    <w:p>
-      <w:pPr>
-        <w:ind w:left="720" w:hanging="436"/>
-        <w:rPr>
-          <w:rFonts w:ascii="Noto Serif SC" w:eastAsia="Noto Serif SC" w:hAnsi="Noto Serif SC" w:cs="Noto Serif"/>
-          <w:sz w:val="21"/>
-          <w:szCs w:val="21"/>
-          <w:lang w:val="en-US"/>
-        </w:rPr>
-      </w:pPr>
-      <w:r>
-        <w:rPr>
-          <w:rFonts w:ascii="Noto Serif SC" w:eastAsia="Noto Serif SC" w:hAnsi="Noto Serif SC" w:cs="Noto Serif"/>
-          <w:sz w:val="21"/>
-          <w:szCs w:val="21"/>
-          <w:lang w:val="en-US"/>
-        </w:rPr>
-        <w:t xml:space="preserve">VI: </w:t>
-      </w:r>
-      <w:r>
-        <w:rPr>
-          <w:rFonts w:ascii="Noto Serif SC" w:eastAsia="Noto Serif SC" w:hAnsi="Noto Serif SC" w:cs="Noto Serif" w:hint="eastAsia"/>
-          <w:sz w:val="21"/>
-          <w:szCs w:val="21"/>
-        </w:rPr>
-        <w:t>低音军鼓</w:t>
-      </w:r>
-      <w:r>
-        <w:rPr>
-          <w:rFonts w:ascii="Noto Serif SC" w:eastAsia="Noto Serif SC" w:hAnsi="Noto Serif SC" w:cs="Noto Serif"/>
-          <w:sz w:val="21"/>
-          <w:szCs w:val="21"/>
-        </w:rPr>
-        <w:t xml:space="preserve"> </w:t>
-      </w:r>
-      <w:proofErr w:type="spellStart"/>
-      <w:r>
-        <w:rPr>
-          <w:rFonts w:ascii="Noto Serif SC" w:eastAsia="Noto Serif SC" w:hAnsi="Noto Serif SC" w:cs="Noto Serif"/>
-          <w:sz w:val="21"/>
-          <w:szCs w:val="21"/>
-        </w:rPr>
-        <w:t>Diyin</w:t>
-      </w:r>
-      <w:proofErr w:type="spellEnd"/>
-      <w:r>
-        <w:rPr>
-          <w:rFonts w:ascii="Noto Serif SC" w:eastAsia="Noto Serif SC" w:hAnsi="Noto Serif SC" w:cs="Noto Serif"/>
-          <w:sz w:val="21"/>
-          <w:szCs w:val="21"/>
-        </w:rPr>
-        <w:t xml:space="preserve"> </w:t>
-      </w:r>
-      <w:proofErr w:type="spellStart"/>
-      <w:r>
-        <w:rPr>
-          <w:rFonts w:ascii="Noto Serif SC" w:eastAsia="Noto Serif SC" w:hAnsi="Noto Serif SC" w:cs="Noto Serif"/>
-          <w:sz w:val="21"/>
-          <w:szCs w:val="21"/>
-        </w:rPr>
-        <w:t>Jungu</w:t>
-      </w:r>
-      <w:proofErr w:type="spellEnd"/>
-      <w:r>
-        <w:rPr>
-          <w:rFonts w:ascii="Noto Serif SC" w:eastAsia="Noto Serif SC" w:hAnsi="Noto Serif SC" w:cs="Noto Serif"/>
-          <w:sz w:val="21"/>
-          <w:szCs w:val="21"/>
-        </w:rPr>
-        <w:t xml:space="preserve">, </w:t>
-      </w:r>
-      <w:r>
-        <w:rPr>
-          <w:rFonts w:ascii="Noto Serif SC" w:eastAsia="Noto Serif SC" w:hAnsi="Noto Serif SC" w:cs="Noto Serif" w:hint="eastAsia"/>
-          <w:sz w:val="21"/>
-          <w:szCs w:val="21"/>
-        </w:rPr>
-        <w:t>狮钹</w:t>
-      </w:r>
-      <w:r>
-        <w:rPr>
-          <w:rFonts w:ascii="Noto Serif SC" w:eastAsia="Noto Serif SC" w:hAnsi="Noto Serif SC" w:cs="Noto Serif"/>
-          <w:sz w:val="21"/>
-          <w:szCs w:val="21"/>
-        </w:rPr>
-        <w:t xml:space="preserve"> </w:t>
-      </w:r>
-      <w:proofErr w:type="spellStart"/>
-      <w:r>
-        <w:rPr>
-          <w:rFonts w:ascii="Noto Serif SC" w:eastAsia="Noto Serif SC" w:hAnsi="Noto Serif SC" w:cs="Noto Serif"/>
-          <w:sz w:val="21"/>
-          <w:szCs w:val="21"/>
-        </w:rPr>
-        <w:t>Shibo</w:t>
-      </w:r>
-      <w:proofErr w:type="spellEnd"/>
-      <w:r>
-        <w:rPr>
-          <w:rFonts w:ascii="Noto Serif SC" w:eastAsia="Noto Serif SC" w:hAnsi="Noto Serif SC" w:cs="Noto Serif"/>
-          <w:sz w:val="21"/>
-          <w:szCs w:val="21"/>
-        </w:rPr>
-        <w:t xml:space="preserve">, </w:t>
-      </w:r>
-      <w:r>
-        <w:rPr>
-          <w:rFonts w:ascii="Noto Serif SC" w:eastAsia="Noto Serif SC" w:hAnsi="Noto Serif SC" w:cs="Noto Serif" w:hint="eastAsia"/>
-          <w:sz w:val="21"/>
-          <w:szCs w:val="21"/>
-        </w:rPr>
-        <w:t>高音木鱼</w:t>
-      </w:r>
-      <w:r>
-        <w:rPr>
-          <w:rFonts w:ascii="Noto Serif SC" w:eastAsia="Noto Serif SC" w:hAnsi="Noto Serif SC" w:cs="Noto Serif"/>
-          <w:sz w:val="21"/>
-          <w:szCs w:val="21"/>
-        </w:rPr>
-        <w:t xml:space="preserve"> High Wooden Fish, </w:t>
-      </w:r>
-      <w:r>
-        <w:rPr>
-          <w:rFonts w:ascii="Noto Serif SC" w:eastAsia="Noto Serif SC" w:hAnsi="Noto Serif SC" w:cs="Noto Serif" w:hint="eastAsia"/>
-          <w:sz w:val="21"/>
-          <w:szCs w:val="21"/>
-        </w:rPr>
-        <w:t>狮钹</w:t>
-      </w:r>
-      <w:r>
-        <w:rPr>
-          <w:rFonts w:ascii="Noto Serif SC" w:eastAsia="Noto Serif SC" w:hAnsi="Noto Serif SC" w:cs="Noto Serif"/>
-          <w:sz w:val="21"/>
-          <w:szCs w:val="21"/>
-        </w:rPr>
-        <w:t xml:space="preserve"> </w:t>
-      </w:r>
-      <w:proofErr w:type="spellStart"/>
-      <w:r>
-        <w:rPr>
-          <w:rFonts w:ascii="Noto Serif SC" w:eastAsia="Noto Serif SC" w:hAnsi="Noto Serif SC" w:cs="Noto Serif"/>
-          <w:sz w:val="21"/>
-          <w:szCs w:val="21"/>
-        </w:rPr>
-        <w:t>Shibo</w:t>
-      </w:r>
-      <w:proofErr w:type="spellEnd"/>
-      <w:r>
-        <w:rPr>
-          <w:rFonts w:ascii="Noto Serif SC" w:eastAsia="Noto Serif SC" w:hAnsi="Noto Serif SC" w:cs="Noto Serif"/>
-          <w:sz w:val="21"/>
-          <w:szCs w:val="21"/>
-        </w:rPr>
-        <w:t xml:space="preserve">, </w:t>
-      </w:r>
-      <w:r>
-        <w:rPr>
-          <w:rFonts w:ascii="Noto Serif SC" w:eastAsia="Noto Serif SC" w:hAnsi="Noto Serif SC" w:cs="Noto Serif" w:hint="eastAsia"/>
-          <w:sz w:val="21"/>
-          <w:szCs w:val="21"/>
-        </w:rPr>
-        <w:t>军钹</w:t>
-      </w:r>
-      <w:r>
-        <w:rPr>
-          <w:rFonts w:ascii="Noto Serif SC" w:eastAsia="Noto Serif SC" w:hAnsi="Noto Serif SC" w:cs="Noto Serif"/>
-          <w:sz w:val="21"/>
-          <w:szCs w:val="21"/>
-        </w:rPr>
-        <w:t xml:space="preserve"> </w:t>
-      </w:r>
-      <w:proofErr w:type="spellStart"/>
-      <w:r>
-        <w:rPr>
-          <w:rFonts w:ascii="Noto Serif SC" w:eastAsia="Noto Serif SC" w:hAnsi="Noto Serif SC" w:cs="Noto Serif"/>
-          <w:sz w:val="21"/>
-          <w:szCs w:val="21"/>
-        </w:rPr>
-        <w:t>Junbo</w:t>
-      </w:r>
-      <w:proofErr w:type="spellEnd"/>
-    </w:p>
-    <w:p>
-      <w:pPr>
-        <w:ind w:left="720" w:hanging="436"/>
-        <w:rPr>
-          <w:rFonts w:ascii="Noto Serif SC" w:eastAsia="Noto Serif SC" w:hAnsi="Noto Serif SC" w:cs="Noto Serif"/>
-          <w:sz w:val="21"/>
-          <w:szCs w:val="21"/>
-          <w:lang w:val="en-US"/>
-        </w:rPr>
-      </w:pPr>
-      <w:r>
-        <w:rPr>
-          <w:rFonts w:ascii="Noto Serif SC" w:eastAsia="Noto Serif SC" w:hAnsi="Noto Serif SC" w:cs="Noto Serif"/>
-          <w:sz w:val="21"/>
-          <w:szCs w:val="21"/>
-          <w:lang w:val="en-US"/>
-        </w:rPr>
-        <w:t xml:space="preserve">VII: </w:t>
-      </w:r>
-      <w:r>
-        <w:rPr>
-          <w:rFonts w:ascii="Noto Serif SC" w:eastAsia="Noto Serif SC" w:hAnsi="Noto Serif SC" w:cs="Noto Serif" w:hint="eastAsia"/>
-          <w:sz w:val="21"/>
-          <w:szCs w:val="21"/>
-        </w:rPr>
-        <w:t>拍板</w:t>
-      </w:r>
-      <w:r>
-        <w:rPr>
-          <w:rFonts w:ascii="Noto Serif SC" w:eastAsia="Noto Serif SC" w:hAnsi="Noto Serif SC" w:cs="Noto Serif"/>
-          <w:sz w:val="21"/>
-          <w:szCs w:val="21"/>
-          <w:lang w:val="en-GB"/>
-        </w:rPr>
-        <w:t xml:space="preserve"> </w:t>
-      </w:r>
-      <w:r>
-        <w:rPr>
-          <w:rFonts w:ascii="Noto Serif SC" w:eastAsia="Noto Serif SC" w:hAnsi="Noto Serif SC" w:cs="Noto Serif"/>
-          <w:sz w:val="21"/>
-          <w:szCs w:val="21"/>
-        </w:rPr>
-        <w:t xml:space="preserve">Paiban, </w:t>
-      </w:r>
-      <w:r>
-        <w:rPr>
-          <w:rFonts w:ascii="Noto Serif SC" w:eastAsia="Noto Serif SC" w:hAnsi="Noto Serif SC" w:cs="Noto Serif" w:hint="eastAsia"/>
-          <w:sz w:val="21"/>
-          <w:szCs w:val="21"/>
-        </w:rPr>
-        <w:t>狮吼鼓</w:t>
-      </w:r>
-      <w:r>
-        <w:rPr>
-          <w:rFonts w:ascii="Noto Serif SC" w:eastAsia="Noto Serif SC" w:hAnsi="Noto Serif SC" w:cs="Noto Serif"/>
-          <w:sz w:val="21"/>
-          <w:szCs w:val="21"/>
-        </w:rPr>
-        <w:t xml:space="preserve"> Lion roar, </w:t>
-      </w:r>
-      <w:r>
-        <w:rPr>
-          <w:rFonts w:ascii="Noto Serif SC" w:eastAsia="Noto Serif SC" w:hAnsi="Noto Serif SC" w:cs="Noto Serif" w:hint="eastAsia"/>
-          <w:sz w:val="21"/>
-          <w:szCs w:val="21"/>
-        </w:rPr>
-        <w:t>低音大锣</w:t>
-      </w:r>
-      <w:r>
-        <w:rPr>
-          <w:rFonts w:ascii="Noto Serif SC" w:eastAsia="Noto Serif SC" w:hAnsi="Noto Serif SC" w:cs="Noto Serif"/>
-          <w:sz w:val="21"/>
-          <w:szCs w:val="21"/>
-        </w:rPr>
-        <w:t xml:space="preserve"> </w:t>
-      </w:r>
-      <w:proofErr w:type="spellStart"/>
-      <w:r>
-        <w:rPr>
-          <w:rFonts w:ascii="Noto Serif SC" w:eastAsia="Noto Serif SC" w:hAnsi="Noto Serif SC" w:cs="Noto Serif"/>
-          <w:sz w:val="21"/>
-          <w:szCs w:val="21"/>
-        </w:rPr>
-        <w:t>Diyin</w:t>
-      </w:r>
-      <w:proofErr w:type="spellEnd"/>
-      <w:r>
-        <w:rPr>
-          <w:rFonts w:ascii="Noto Serif SC" w:eastAsia="Noto Serif SC" w:hAnsi="Noto Serif SC" w:cs="Noto Serif"/>
-          <w:sz w:val="21"/>
-          <w:szCs w:val="21"/>
-        </w:rPr>
-        <w:t xml:space="preserve"> </w:t>
-      </w:r>
-      <w:proofErr w:type="spellStart"/>
-      <w:r>
-        <w:rPr>
-          <w:rFonts w:ascii="Noto Serif SC" w:eastAsia="Noto Serif SC" w:hAnsi="Noto Serif SC" w:cs="Noto Serif"/>
-          <w:sz w:val="21"/>
-          <w:szCs w:val="21"/>
-        </w:rPr>
-        <w:t>Daluo</w:t>
-      </w:r>
-      <w:proofErr w:type="spellEnd"/>
-      <w:r>
-        <w:rPr>
-          <w:rFonts w:ascii="Noto Serif SC" w:eastAsia="Noto Serif SC" w:hAnsi="Noto Serif SC" w:cs="Noto Serif"/>
-          <w:sz w:val="21"/>
-          <w:szCs w:val="21"/>
-        </w:rPr>
-        <w:t xml:space="preserve">, </w:t>
-      </w:r>
-      <w:r>
-        <w:rPr>
-          <w:rFonts w:ascii="Noto Serif SC" w:eastAsia="Noto Serif SC" w:hAnsi="Noto Serif SC" w:cs="Noto Serif" w:hint="eastAsia"/>
-          <w:sz w:val="21"/>
-          <w:szCs w:val="21"/>
-        </w:rPr>
-        <w:t>高边锣</w:t>
-      </w:r>
-      <w:r>
-        <w:rPr>
-          <w:rFonts w:ascii="Noto Serif SC" w:eastAsia="Noto Serif SC" w:hAnsi="Noto Serif SC" w:cs="Noto Serif"/>
-          <w:sz w:val="21"/>
-          <w:szCs w:val="21"/>
-        </w:rPr>
-        <w:t xml:space="preserve"> Gao </w:t>
-      </w:r>
-      <w:proofErr w:type="spellStart"/>
-      <w:r>
-        <w:rPr>
-          <w:rFonts w:ascii="Noto Serif SC" w:eastAsia="Noto Serif SC" w:hAnsi="Noto Serif SC" w:cs="Noto Serif"/>
-          <w:sz w:val="21"/>
-          <w:szCs w:val="21"/>
-        </w:rPr>
-        <w:t>Bianluo</w:t>
-      </w:r>
-      <w:proofErr w:type="spellEnd"/>
-      <w:r>
-        <w:rPr>
-          <w:rFonts w:ascii="Noto Serif SC" w:eastAsia="Noto Serif SC" w:hAnsi="Noto Serif SC" w:cs="Noto Serif"/>
-          <w:sz w:val="21"/>
-          <w:szCs w:val="21"/>
-        </w:rPr>
-        <w:t xml:space="preserve">, </w:t>
-      </w:r>
-      <w:r>
-        <w:rPr>
-          <w:rFonts w:ascii="Noto Serif SC" w:eastAsia="Noto Serif SC" w:hAnsi="Noto Serif SC" w:cs="Noto Serif" w:hint="eastAsia"/>
-          <w:sz w:val="21"/>
-          <w:szCs w:val="21"/>
-        </w:rPr>
-        <w:t>低音罄</w:t>
-      </w:r>
-      <w:r>
-        <w:rPr>
-          <w:rFonts w:ascii="Noto Serif SC" w:eastAsia="Noto Serif SC" w:hAnsi="Noto Serif SC" w:cs="Noto Serif"/>
-          <w:sz w:val="21"/>
-          <w:szCs w:val="21"/>
-        </w:rPr>
-        <w:t xml:space="preserve"> Diyin Qing</w:t>
-      </w:r>
-      <w:r>
-        <w:rPr>
-          <w:rFonts w:ascii="Noto Serif SC" w:eastAsia="Noto Serif SC" w:hAnsi="Noto Serif SC" w:cs="Noto Serif"/>
-          <w:sz w:val="21"/>
-          <w:szCs w:val="21"/>
-        </w:rPr>
-        <w:t xml:space="preserve"> </w:t>
-      </w:r>
-    </w:p>
-    <w:p>
-      <w:pPr>
-        <w:rPr>
-          <w:rFonts w:ascii="Noto Serif SC" w:eastAsia="Noto Serif SC" w:hAnsi="Noto Serif SC" w:cs="Noto Serif"/>
-          <w:sz w:val="24"/>
-          <w:szCs w:val="24"/>
-          <w:lang w:val="en-US"/>
-        </w:rPr>
-      </w:pPr>
-    </w:p>
-    <w:p>
-      <w:pPr>
-        <w:rPr>
-          <w:rFonts w:ascii="Noto Serif SC" w:eastAsia="Noto Serif SC" w:hAnsi="Noto Serif SC" w:cs="Noto Serif"/>
-          <w:sz w:val="24"/>
-          <w:szCs w:val="24"/>
-          <w:lang w:val="en-US"/>
-        </w:rPr>
-      </w:pPr>
-      <w:r>
-        <w:rPr>
-          <w:rFonts w:ascii="Noto Serif SC" w:eastAsia="Noto Serif SC" w:hAnsi="Noto Serif SC" w:cs="Noto Serif" w:hint="eastAsia"/>
-          <w:sz w:val="24"/>
-          <w:szCs w:val="24"/>
-          <w:lang w:val="en-US"/>
-        </w:rPr>
-        <w:t>笛子独奏</w:t>
-      </w:r>
-      <w:r>
-        <w:rPr>
-          <w:rFonts w:ascii="Noto Serif SC" w:eastAsia="Noto Serif SC" w:hAnsi="Noto Serif SC" w:cs="Noto Serif"/>
-          <w:sz w:val="24"/>
-          <w:szCs w:val="24"/>
-          <w:lang w:val="en-US"/>
-        </w:rPr>
-        <w:t xml:space="preserve"> Dizi Solo</w:t>
-      </w:r>
-    </w:p>
-    <w:p>
-      <w:pPr>
-        <w:rPr>
-          <w:rFonts w:ascii="Noto Serif SC" w:eastAsia="Noto Serif SC" w:hAnsi="Noto Serif SC" w:cs="Noto Serif"/>
-          <w:sz w:val="24"/>
-          <w:szCs w:val="24"/>
-          <w:lang w:val="en-US"/>
         </w:rPr>
       </w:pPr>
     </w:p>

</xml_diff>